<commit_message>
Refresh air contacts SOP files
Updated the air contacts SOP source documents and the Android raw asset to reflect the latest SOP content and formatting.
</commit_message>
<xml_diff>
--- a/resources/air_contacts_sop.docx
+++ b/resources/air_contacts_sop.docx
@@ -30,6 +30,228 @@
         </w:rPr>
         <w:t>User Guide</w:t>
       </w:r>
+    </w:p>
+    <w:p>
+      <w:pPr>
+        <w:pStyle w:val="IntenseHeading"/>
+      </w:pPr>
+      <w:r>
+        <w:t>INSTRUCTIONS</w:t>
+      </w:r>
+    </w:p>
+    <w:p>
+      <w:pPr>
+        <w:pStyle w:val="ListParagraph"/>
+        <w:numPr>
+          <w:ilvl w:val="0"/>
+          <w:numId w:val="5"/>
+        </w:numPr>
+        <w:rPr>
+          <w:rFonts w:asciiTheme="minorBidi" w:hAnsiTheme="minorBidi"/>
+          <w:sz w:val="24"/>
+          <w:szCs w:val="24"/>
+        </w:rPr>
+      </w:pPr>
+      <w:r>
+        <w:rPr>
+          <w:rFonts w:asciiTheme="minorBidi" w:hAnsiTheme="minorBidi"/>
+          <w:sz w:val="24"/>
+          <w:szCs w:val="24"/>
+        </w:rPr>
+        <w:t>The app automatically syncs after 30 to 45 days.</w:t>
+      </w:r>
+    </w:p>
+    <w:p>
+      <w:pPr>
+        <w:pStyle w:val="ListParagraph"/>
+        <w:numPr>
+          <w:ilvl w:val="0"/>
+          <w:numId w:val="5"/>
+        </w:numPr>
+        <w:rPr>
+          <w:rFonts w:asciiTheme="minorBidi" w:hAnsiTheme="minorBidi"/>
+          <w:sz w:val="24"/>
+          <w:szCs w:val="24"/>
+        </w:rPr>
+      </w:pPr>
+      <w:r>
+        <w:rPr>
+          <w:rFonts w:asciiTheme="minorBidi" w:hAnsiTheme="minorBidi"/>
+          <w:sz w:val="24"/>
+          <w:szCs w:val="24"/>
+        </w:rPr>
+        <w:t>Hence, there is no need to sync manually.</w:t>
+      </w:r>
+    </w:p>
+    <w:p>
+      <w:pPr>
+        <w:pStyle w:val="ListParagraph"/>
+        <w:numPr>
+          <w:ilvl w:val="0"/>
+          <w:numId w:val="5"/>
+        </w:numPr>
+        <w:rPr>
+          <w:rFonts w:asciiTheme="minorBidi" w:hAnsiTheme="minorBidi"/>
+          <w:sz w:val="24"/>
+          <w:szCs w:val="24"/>
+        </w:rPr>
+      </w:pPr>
+      <w:r>
+        <w:rPr>
+          <w:rFonts w:asciiTheme="minorBidi" w:hAnsiTheme="minorBidi"/>
+          <w:sz w:val="24"/>
+          <w:szCs w:val="24"/>
+        </w:rPr>
+        <w:t>The only case in which manual sync may be performed is if a specific contact cannot be found in the user contacts.</w:t>
+      </w:r>
+    </w:p>
+    <w:p>
+      <w:pPr>
+        <w:pStyle w:val="ListParagraph"/>
+        <w:numPr>
+          <w:ilvl w:val="0"/>
+          <w:numId w:val="5"/>
+        </w:numPr>
+        <w:rPr>
+          <w:rFonts w:asciiTheme="minorBidi" w:hAnsiTheme="minorBidi"/>
+          <w:sz w:val="24"/>
+          <w:szCs w:val="24"/>
+        </w:rPr>
+      </w:pPr>
+      <w:r>
+        <w:rPr>
+          <w:rFonts w:asciiTheme="minorBidi" w:hAnsiTheme="minorBidi"/>
+          <w:sz w:val="24"/>
+          <w:szCs w:val="24"/>
+        </w:rPr>
+        <w:t>Frequent manual sync attempts will cause very high drainage of battery time and life.</w:t>
+      </w:r>
+    </w:p>
+    <w:p>
+      <w:pPr>
+        <w:pStyle w:val="ListParagraph"/>
+        <w:numPr>
+          <w:ilvl w:val="0"/>
+          <w:numId w:val="5"/>
+        </w:numPr>
+        <w:rPr>
+          <w:rFonts w:asciiTheme="minorBidi" w:hAnsiTheme="minorBidi"/>
+          <w:sz w:val="24"/>
+          <w:szCs w:val="24"/>
+        </w:rPr>
+      </w:pPr>
+      <w:proofErr w:type="spellStart"/>
+      <w:r>
+        <w:rPr>
+          <w:rFonts w:asciiTheme="minorBidi" w:hAnsiTheme="minorBidi"/>
+          <w:sz w:val="24"/>
+          <w:szCs w:val="24"/>
+        </w:rPr>
+        <w:t>AirContacts</w:t>
+      </w:r>
+      <w:proofErr w:type="spellEnd"/>
+      <w:r>
+        <w:rPr>
+          <w:rFonts w:asciiTheme="minorBidi" w:hAnsiTheme="minorBidi"/>
+          <w:sz w:val="24"/>
+          <w:szCs w:val="24"/>
+        </w:rPr>
+        <w:t xml:space="preserve"> is an indigenously developed App that automatically synchronizes Air Directory (PAFCOM LTE - DEFCOM - </w:t>
+      </w:r>
+      <w:proofErr w:type="spellStart"/>
+      <w:r>
+        <w:rPr>
+          <w:rFonts w:asciiTheme="minorBidi" w:hAnsiTheme="minorBidi"/>
+          <w:sz w:val="24"/>
+          <w:szCs w:val="24"/>
+        </w:rPr>
+        <w:t>AirCom</w:t>
+      </w:r>
+      <w:proofErr w:type="spellEnd"/>
+      <w:r>
+        <w:rPr>
+          <w:rFonts w:asciiTheme="minorBidi" w:hAnsiTheme="minorBidi"/>
+          <w:sz w:val="24"/>
+          <w:szCs w:val="24"/>
+        </w:rPr>
+        <w:t xml:space="preserve"> Contacts).</w:t>
+      </w:r>
+    </w:p>
+    <w:p>
+      <w:pPr>
+        <w:pStyle w:val="ListParagraph"/>
+        <w:numPr>
+          <w:ilvl w:val="0"/>
+          <w:numId w:val="5"/>
+        </w:numPr>
+        <w:rPr>
+          <w:rFonts w:asciiTheme="minorBidi" w:hAnsiTheme="minorBidi"/>
+          <w:sz w:val="24"/>
+          <w:szCs w:val="24"/>
+        </w:rPr>
+      </w:pPr>
+      <w:r>
+        <w:rPr>
+          <w:rFonts w:asciiTheme="minorBidi" w:hAnsiTheme="minorBidi"/>
+          <w:sz w:val="24"/>
+          <w:szCs w:val="24"/>
+        </w:rPr>
+        <w:t>Sync Button updates the contacts manually.</w:t>
+      </w:r>
+    </w:p>
+    <w:p>
+      <w:pPr>
+        <w:pStyle w:val="ListParagraph"/>
+        <w:numPr>
+          <w:ilvl w:val="0"/>
+          <w:numId w:val="5"/>
+        </w:numPr>
+        <w:rPr>
+          <w:rFonts w:asciiTheme="minorBidi" w:hAnsiTheme="minorBidi"/>
+          <w:sz w:val="24"/>
+          <w:szCs w:val="24"/>
+        </w:rPr>
+      </w:pPr>
+      <w:r>
+        <w:rPr>
+          <w:rFonts w:asciiTheme="minorBidi" w:hAnsiTheme="minorBidi"/>
+          <w:sz w:val="24"/>
+          <w:szCs w:val="24"/>
+        </w:rPr>
+        <w:t>On initial installation, users are requested to delete local contacts (only the first time).</w:t>
+      </w:r>
+    </w:p>
+    <w:p>
+      <w:pPr>
+        <w:pStyle w:val="ListParagraph"/>
+        <w:numPr>
+          <w:ilvl w:val="0"/>
+          <w:numId w:val="5"/>
+        </w:numPr>
+        <w:rPr>
+          <w:rFonts w:asciiTheme="minorBidi" w:hAnsiTheme="minorBidi"/>
+          <w:sz w:val="24"/>
+          <w:szCs w:val="24"/>
+        </w:rPr>
+      </w:pPr>
+      <w:r>
+        <w:rPr>
+          <w:rFonts w:asciiTheme="minorBidi" w:hAnsiTheme="minorBidi"/>
+          <w:sz w:val="24"/>
+          <w:szCs w:val="24"/>
+        </w:rPr>
+        <w:t>Further help is available by pressing info button at the top right.</w:t>
+      </w:r>
+    </w:p>
+    <w:p>
+      <w:pPr>
+        <w:pStyle w:val="ListParagraph"/>
+        <w:rPr>
+          <w:rFonts w:asciiTheme="minorBidi" w:hAnsiTheme="minorBidi"/>
+          <w:sz w:val="24"/>
+          <w:szCs w:val="24"/>
+        </w:rPr>
+      </w:pPr>
     </w:p>
     <w:p>
       <w:pPr>
@@ -141,9 +363,9 @@
           <w:noProof/>
         </w:rPr>
         <w:drawing>
-          <wp:inline distT="0" distB="0" distL="0" distR="0" wp14:anchorId="2C50BE11" wp14:editId="13F15003">
-            <wp:extent cx="1827530" cy="2549819"/>
-            <wp:effectExtent l="0" t="0" r="1270" b="3175"/>
+          <wp:inline distT="0" distB="0" distL="0" distR="0" wp14:anchorId="2C50BE11" wp14:editId="4B288976">
+            <wp:extent cx="1826895" cy="3967983"/>
+            <wp:effectExtent l="0" t="0" r="1905" b="0"/>
             <wp:docPr id="7" name="Picture 7"/>
             <wp:cNvGraphicFramePr>
               <a:graphicFrameLocks xmlns:a="http://schemas.openxmlformats.org/drawingml/2006/main" noChangeAspect="1"/>
@@ -165,13 +387,13 @@
                         </a:ext>
                       </a:extLst>
                     </a:blip>
-                    <a:srcRect t="35603"/>
+                    <a:srcRect t="-249"/>
                     <a:stretch/>
                   </pic:blipFill>
                   <pic:spPr bwMode="auto">
                     <a:xfrm>
                       <a:off x="0" y="0"/>
-                      <a:ext cx="1827752" cy="2550129"/>
+                      <a:ext cx="1827752" cy="3969844"/>
                     </a:xfrm>
                     <a:prstGeom prst="rect">
                       <a:avLst/>
@@ -640,6 +862,7 @@
         <w:rPr>
           <w:noProof/>
         </w:rPr>
+        <w:lastRenderedPageBreak/>
         <mc:AlternateContent>
           <mc:Choice Requires="wps">
             <w:drawing>
@@ -723,8 +946,8 @@
           <w:noProof/>
         </w:rPr>
         <w:drawing>
-          <wp:inline distT="0" distB="0" distL="0" distR="0" wp14:anchorId="048B89CA" wp14:editId="268A7418">
-            <wp:extent cx="1827530" cy="2286000"/>
+          <wp:inline distT="0" distB="0" distL="0" distR="0" wp14:anchorId="048B89CA" wp14:editId="520AD129">
+            <wp:extent cx="1827530" cy="3949700"/>
             <wp:effectExtent l="0" t="0" r="1270" b="0"/>
             <wp:docPr id="3" name="Picture 3"/>
             <wp:cNvGraphicFramePr>
@@ -747,13 +970,13 @@
                         </a:ext>
                       </a:extLst>
                     </a:blip>
-                    <a:srcRect b="42266"/>
+                    <a:srcRect b="249"/>
                     <a:stretch/>
                   </pic:blipFill>
                   <pic:spPr bwMode="auto">
                     <a:xfrm>
                       <a:off x="0" y="0"/>
-                      <a:ext cx="1827752" cy="2286278"/>
+                      <a:ext cx="1827752" cy="3950180"/>
                     </a:xfrm>
                     <a:prstGeom prst="rect">
                       <a:avLst/>
@@ -1028,7 +1251,6 @@
         <w:rPr>
           <w:noProof/>
         </w:rPr>
-        <w:lastRenderedPageBreak/>
         <mc:AlternateContent>
           <mc:Choice Requires="wps">
             <w:drawing>
@@ -1498,8 +1720,8 @@
           <w:noProof/>
         </w:rPr>
         <w:drawing>
-          <wp:inline distT="0" distB="0" distL="0" distR="0" wp14:anchorId="6237B319" wp14:editId="6FD1CBEE">
-            <wp:extent cx="1827220" cy="2673350"/>
+          <wp:inline distT="0" distB="0" distL="0" distR="0" wp14:anchorId="6237B319" wp14:editId="1880833A">
+            <wp:extent cx="1826895" cy="3949224"/>
             <wp:effectExtent l="0" t="0" r="1905" b="0"/>
             <wp:docPr id="14" name="Picture 14"/>
             <wp:cNvGraphicFramePr>
@@ -1522,13 +1744,13 @@
                         </a:ext>
                       </a:extLst>
                     </a:blip>
-                    <a:srcRect t="32473" b="1"/>
+                    <a:srcRect t="228" b="1"/>
                     <a:stretch/>
                   </pic:blipFill>
                   <pic:spPr bwMode="auto">
                     <a:xfrm>
                       <a:off x="0" y="0"/>
-                      <a:ext cx="1827530" cy="2673803"/>
+                      <a:ext cx="1827530" cy="3950597"/>
                     </a:xfrm>
                     <a:prstGeom prst="rect">
                       <a:avLst/>
@@ -1602,9 +1824,6 @@
         </w:rPr>
         <w:t xml:space="preserve"> from the App Menu.</w:t>
       </w:r>
-      <w:r>
-        <w:br w:type="page"/>
-      </w:r>
     </w:p>
     <w:p>
       <w:pPr>
@@ -1614,7 +1833,6 @@
         <w:rPr>
           <w:noProof/>
         </w:rPr>
-        <w:lastRenderedPageBreak/>
         <mc:AlternateContent>
           <mc:Choice Requires="wps">
             <w:drawing>
@@ -1985,6 +2203,7 @@
         <w:rPr>
           <w:noProof/>
         </w:rPr>
+        <w:lastRenderedPageBreak/>
         <mc:AlternateContent>
           <mc:Choice Requires="wps">
             <w:drawing>
@@ -3776,6 +3995,95 @@
 <file path=word/numbering.xml><?xml version="1.0" encoding="utf-8"?>
 <w:numbering xmlns:wpc="http://schemas.microsoft.com/office/word/2010/wordprocessingCanvas" xmlns:cx="http://schemas.microsoft.com/office/drawing/2014/chartex" xmlns:cx1="http://schemas.microsoft.com/office/drawing/2015/9/8/chartex" xmlns:cx2="http://schemas.microsoft.com/office/drawing/2015/10/21/chartex" xmlns:cx3="http://schemas.microsoft.com/office/drawing/2016/5/9/chartex" xmlns:cx4="http://schemas.microsoft.com/office/drawing/2016/5/10/chartex" xmlns:cx5="http://schemas.microsoft.com/office/drawing/2016/5/11/chartex" xmlns:cx6="http://schemas.microsoft.com/office/drawing/2016/5/12/chartex" xmlns:cx7="http://schemas.microsoft.com/office/drawing/2016/5/13/chartex" xmlns:cx8="http://schemas.microsoft.com/office/drawing/2016/5/14/chartex" xmlns:mc="http://schemas.openxmlformats.org/markup-compatibility/2006" xmlns:aink="http://schemas.microsoft.com/office/drawing/2016/ink" xmlns:am3d="http://schemas.microsoft.com/office/drawing/2017/model3d" xmlns:o="urn:schemas-microsoft-com:office:office" xmlns:oel="http://schemas.microsoft.com/office/2019/extlst" xmlns:r="http://schemas.openxmlformats.org/officeDocument/2006/relationships" xmlns:m="http://schemas.openxmlformats.org/officeDocument/2006/math" xmlns:v="urn:schemas-microsoft-com:vml" xmlns:wp14="http://schemas.microsoft.com/office/word/2010/wordprocessingDrawing" xmlns:wp="http://schemas.openxmlformats.org/drawingml/2006/wordprocessingDrawing" xmlns:w10="urn:schemas-microsoft-com:office:word" xmlns:w="http://schemas.openxmlformats.org/wordprocessingml/2006/main" xmlns:w14="http://schemas.microsoft.com/office/word/2010/wordml" xmlns:w15="http://schemas.microsoft.com/office/word/2012/wordml" xmlns:w16cex="http://schemas.microsoft.com/office/word/2018/wordml/cex" xmlns:w16cid="http://schemas.microsoft.com/office/word/2016/wordml/cid" xmlns:w16="http://schemas.microsoft.com/office/word/2018/wordml" xmlns:w16sdtdh="http://schemas.microsoft.com/office/word/2020/wordml/sdtdatahash" xmlns:w16se="http://schemas.microsoft.com/office/word/2015/wordml/symex" xmlns:wpg="http://schemas.microsoft.com/office/word/2010/wordprocessingGroup" xmlns:wpi="http://schemas.microsoft.com/office/word/2010/wordprocessingInk" xmlns:wne="http://schemas.microsoft.com/office/word/2006/wordml" xmlns:wps="http://schemas.microsoft.com/office/word/2010/wordprocessingShape" mc:Ignorable="w14 w15 w16se w16cid w16 w16cex w16sdtdh wp14">
   <w:abstractNum w:abstractNumId="0" w15:restartNumberingAfterBreak="0">
+    <w:nsid w:val="11547675"/>
+    <w:multiLevelType w:val="hybridMultilevel"/>
+    <w:tmpl w:val="B2EEF730"/>
+    <w:lvl w:ilvl="0" w:tplc="0809000F">
+      <w:start w:val="1"/>
+      <w:numFmt w:val="decimal"/>
+      <w:lvlText w:val="%1."/>
+      <w:lvlJc w:val="left"/>
+      <w:pPr>
+        <w:ind w:left="720" w:hanging="360"/>
+      </w:pPr>
+      <w:rPr>
+        <w:rFonts w:hint="default"/>
+      </w:rPr>
+    </w:lvl>
+    <w:lvl w:ilvl="1" w:tplc="08090019" w:tentative="1">
+      <w:start w:val="1"/>
+      <w:numFmt w:val="lowerLetter"/>
+      <w:lvlText w:val="%2."/>
+      <w:lvlJc w:val="left"/>
+      <w:pPr>
+        <w:ind w:left="1440" w:hanging="360"/>
+      </w:pPr>
+    </w:lvl>
+    <w:lvl w:ilvl="2" w:tplc="0809001B" w:tentative="1">
+      <w:start w:val="1"/>
+      <w:numFmt w:val="lowerRoman"/>
+      <w:lvlText w:val="%3."/>
+      <w:lvlJc w:val="right"/>
+      <w:pPr>
+        <w:ind w:left="2160" w:hanging="180"/>
+      </w:pPr>
+    </w:lvl>
+    <w:lvl w:ilvl="3" w:tplc="0809000F" w:tentative="1">
+      <w:start w:val="1"/>
+      <w:numFmt w:val="decimal"/>
+      <w:lvlText w:val="%4."/>
+      <w:lvlJc w:val="left"/>
+      <w:pPr>
+        <w:ind w:left="2880" w:hanging="360"/>
+      </w:pPr>
+    </w:lvl>
+    <w:lvl w:ilvl="4" w:tplc="08090019" w:tentative="1">
+      <w:start w:val="1"/>
+      <w:numFmt w:val="lowerLetter"/>
+      <w:lvlText w:val="%5."/>
+      <w:lvlJc w:val="left"/>
+      <w:pPr>
+        <w:ind w:left="3600" w:hanging="360"/>
+      </w:pPr>
+    </w:lvl>
+    <w:lvl w:ilvl="5" w:tplc="0809001B" w:tentative="1">
+      <w:start w:val="1"/>
+      <w:numFmt w:val="lowerRoman"/>
+      <w:lvlText w:val="%6."/>
+      <w:lvlJc w:val="right"/>
+      <w:pPr>
+        <w:ind w:left="4320" w:hanging="180"/>
+      </w:pPr>
+    </w:lvl>
+    <w:lvl w:ilvl="6" w:tplc="0809000F" w:tentative="1">
+      <w:start w:val="1"/>
+      <w:numFmt w:val="decimal"/>
+      <w:lvlText w:val="%7."/>
+      <w:lvlJc w:val="left"/>
+      <w:pPr>
+        <w:ind w:left="5040" w:hanging="360"/>
+      </w:pPr>
+    </w:lvl>
+    <w:lvl w:ilvl="7" w:tplc="08090019" w:tentative="1">
+      <w:start w:val="1"/>
+      <w:numFmt w:val="lowerLetter"/>
+      <w:lvlText w:val="%8."/>
+      <w:lvlJc w:val="left"/>
+      <w:pPr>
+        <w:ind w:left="5760" w:hanging="360"/>
+      </w:pPr>
+    </w:lvl>
+    <w:lvl w:ilvl="8" w:tplc="0809001B" w:tentative="1">
+      <w:start w:val="1"/>
+      <w:numFmt w:val="lowerRoman"/>
+      <w:lvlText w:val="%9."/>
+      <w:lvlJc w:val="right"/>
+      <w:pPr>
+        <w:ind w:left="6480" w:hanging="180"/>
+      </w:pPr>
+    </w:lvl>
+  </w:abstractNum>
+  <w:abstractNum w:abstractNumId="1" w15:restartNumberingAfterBreak="0">
     <w:nsid w:val="3F58579A"/>
     <w:multiLevelType w:val="hybridMultilevel"/>
     <w:tmpl w:val="83385F84"/>
@@ -3866,7 +4174,93 @@
       </w:pPr>
     </w:lvl>
   </w:abstractNum>
-  <w:abstractNum w:abstractNumId="1" w15:restartNumberingAfterBreak="0">
+  <w:abstractNum w:abstractNumId="2" w15:restartNumberingAfterBreak="0">
+    <w:nsid w:val="4DA873CA"/>
+    <w:multiLevelType w:val="hybridMultilevel"/>
+    <w:tmpl w:val="DF44E41A"/>
+    <w:lvl w:ilvl="0" w:tplc="0809000F">
+      <w:start w:val="1"/>
+      <w:numFmt w:val="decimal"/>
+      <w:lvlText w:val="%1."/>
+      <w:lvlJc w:val="left"/>
+      <w:pPr>
+        <w:ind w:left="720" w:hanging="360"/>
+      </w:pPr>
+    </w:lvl>
+    <w:lvl w:ilvl="1" w:tplc="08090019" w:tentative="1">
+      <w:start w:val="1"/>
+      <w:numFmt w:val="lowerLetter"/>
+      <w:lvlText w:val="%2."/>
+      <w:lvlJc w:val="left"/>
+      <w:pPr>
+        <w:ind w:left="1440" w:hanging="360"/>
+      </w:pPr>
+    </w:lvl>
+    <w:lvl w:ilvl="2" w:tplc="0809001B" w:tentative="1">
+      <w:start w:val="1"/>
+      <w:numFmt w:val="lowerRoman"/>
+      <w:lvlText w:val="%3."/>
+      <w:lvlJc w:val="right"/>
+      <w:pPr>
+        <w:ind w:left="2160" w:hanging="180"/>
+      </w:pPr>
+    </w:lvl>
+    <w:lvl w:ilvl="3" w:tplc="0809000F" w:tentative="1">
+      <w:start w:val="1"/>
+      <w:numFmt w:val="decimal"/>
+      <w:lvlText w:val="%4."/>
+      <w:lvlJc w:val="left"/>
+      <w:pPr>
+        <w:ind w:left="2880" w:hanging="360"/>
+      </w:pPr>
+    </w:lvl>
+    <w:lvl w:ilvl="4" w:tplc="08090019" w:tentative="1">
+      <w:start w:val="1"/>
+      <w:numFmt w:val="lowerLetter"/>
+      <w:lvlText w:val="%5."/>
+      <w:lvlJc w:val="left"/>
+      <w:pPr>
+        <w:ind w:left="3600" w:hanging="360"/>
+      </w:pPr>
+    </w:lvl>
+    <w:lvl w:ilvl="5" w:tplc="0809001B" w:tentative="1">
+      <w:start w:val="1"/>
+      <w:numFmt w:val="lowerRoman"/>
+      <w:lvlText w:val="%6."/>
+      <w:lvlJc w:val="right"/>
+      <w:pPr>
+        <w:ind w:left="4320" w:hanging="180"/>
+      </w:pPr>
+    </w:lvl>
+    <w:lvl w:ilvl="6" w:tplc="0809000F" w:tentative="1">
+      <w:start w:val="1"/>
+      <w:numFmt w:val="decimal"/>
+      <w:lvlText w:val="%7."/>
+      <w:lvlJc w:val="left"/>
+      <w:pPr>
+        <w:ind w:left="5040" w:hanging="360"/>
+      </w:pPr>
+    </w:lvl>
+    <w:lvl w:ilvl="7" w:tplc="08090019" w:tentative="1">
+      <w:start w:val="1"/>
+      <w:numFmt w:val="lowerLetter"/>
+      <w:lvlText w:val="%8."/>
+      <w:lvlJc w:val="left"/>
+      <w:pPr>
+        <w:ind w:left="5760" w:hanging="360"/>
+      </w:pPr>
+    </w:lvl>
+    <w:lvl w:ilvl="8" w:tplc="0809001B" w:tentative="1">
+      <w:start w:val="1"/>
+      <w:numFmt w:val="lowerRoman"/>
+      <w:lvlText w:val="%9."/>
+      <w:lvlJc w:val="right"/>
+      <w:pPr>
+        <w:ind w:left="6480" w:hanging="180"/>
+      </w:pPr>
+    </w:lvl>
+  </w:abstractNum>
+  <w:abstractNum w:abstractNumId="3" w15:restartNumberingAfterBreak="0">
     <w:nsid w:val="524E2E80"/>
     <w:multiLevelType w:val="hybridMultilevel"/>
     <w:tmpl w:val="83385F84"/>
@@ -3957,7 +4351,7 @@
       </w:pPr>
     </w:lvl>
   </w:abstractNum>
-  <w:abstractNum w:abstractNumId="2" w15:restartNumberingAfterBreak="0">
+  <w:abstractNum w:abstractNumId="4" w15:restartNumberingAfterBreak="0">
     <w:nsid w:val="6859672C"/>
     <w:multiLevelType w:val="hybridMultilevel"/>
     <w:tmpl w:val="83385F84"/>
@@ -4049,13 +4443,19 @@
     </w:lvl>
   </w:abstractNum>
   <w:num w:numId="1" w16cid:durableId="1915508532">
+    <w:abstractNumId w:val="3"/>
+  </w:num>
+  <w:num w:numId="2" w16cid:durableId="1076364501">
     <w:abstractNumId w:val="1"/>
   </w:num>
-  <w:num w:numId="2" w16cid:durableId="1076364501">
+  <w:num w:numId="3" w16cid:durableId="325789918">
+    <w:abstractNumId w:val="4"/>
+  </w:num>
+  <w:num w:numId="4" w16cid:durableId="919098862">
+    <w:abstractNumId w:val="2"/>
+  </w:num>
+  <w:num w:numId="5" w16cid:durableId="1515656255">
     <w:abstractNumId w:val="0"/>
-  </w:num>
-  <w:num w:numId="3" w16cid:durableId="325789918">
-    <w:abstractNumId w:val="2"/>
   </w:num>
 </w:numbering>
 </file>

</xml_diff>

<commit_message>
Refresh air contacts SOP assets
Updated the Air Contacts SOP PDF and DOCX files in both the app resource bundle and the repository resource folder. This keeps the packaged Android asset in sync with the latest source document and PDF copy.
</commit_message>
<xml_diff>
--- a/resources/air_contacts_sop.docx
+++ b/resources/air_contacts_sop.docx
@@ -33,11 +33,13 @@
     </w:p>
     <w:p>
       <w:pPr>
-        <w:pStyle w:val="IntenseHeading"/>
-      </w:pPr>
+        <w:pStyle w:val="Heading1"/>
+      </w:pPr>
+      <w:bookmarkStart w:id="0" w:name="_Toc239617976"/>
       <w:r>
         <w:t>INSTRUCTIONS</w:t>
       </w:r>
+      <w:bookmarkEnd w:id="0"/>
     </w:p>
     <w:p>
       <w:pPr>
@@ -245,34 +247,517 @@
     </w:p>
     <w:p>
       <w:pPr>
+        <w:rPr>
+          <w:rFonts w:asciiTheme="minorBidi" w:hAnsiTheme="minorBidi"/>
+          <w:sz w:val="24"/>
+          <w:szCs w:val="24"/>
+        </w:rPr>
+      </w:pPr>
+    </w:p>
+    <w:bookmarkStart w:id="1" w:name="_Toc239617977" w:displacedByCustomXml="next"/>
+    <w:sdt>
+      <w:sdtPr>
+        <w:id w:val="-229157368"/>
+        <w:docPartObj>
+          <w:docPartGallery w:val="Table of Contents"/>
+          <w:docPartUnique/>
+        </w:docPartObj>
+      </w:sdtPr>
+      <w:sdtEndPr>
+        <w:rPr>
+          <w:rFonts w:asciiTheme="minorHAnsi" w:eastAsiaTheme="minorHAnsi" w:hAnsiTheme="minorHAnsi" w:cstheme="minorBidi"/>
+          <w:b/>
+          <w:bCs/>
+          <w:noProof/>
+          <w:color w:val="auto"/>
+          <w:sz w:val="22"/>
+          <w:szCs w:val="22"/>
+        </w:rPr>
+      </w:sdtEndPr>
+      <w:sdtContent>
+        <w:p>
+          <w:pPr>
+            <w:pStyle w:val="Heading2"/>
+            <w:rPr>
+              <w:rFonts w:asciiTheme="minorBidi" w:hAnsiTheme="minorBidi" w:cstheme="minorBidi"/>
+              <w:sz w:val="32"/>
+              <w:szCs w:val="32"/>
+            </w:rPr>
+          </w:pPr>
+          <w:r>
+            <w:rPr>
+              <w:rFonts w:asciiTheme="minorBidi" w:hAnsiTheme="minorBidi" w:cstheme="minorBidi"/>
+              <w:sz w:val="32"/>
+              <w:szCs w:val="32"/>
+            </w:rPr>
+            <w:t>TABLE OF C</w:t>
+          </w:r>
+          <w:r>
+            <w:rPr>
+              <w:rFonts w:asciiTheme="minorBidi" w:hAnsiTheme="minorBidi" w:cstheme="minorBidi"/>
+              <w:sz w:val="32"/>
+              <w:szCs w:val="32"/>
+            </w:rPr>
+            <w:t>ONTENTS</w:t>
+          </w:r>
+          <w:bookmarkEnd w:id="1"/>
+        </w:p>
+        <w:p>
+          <w:pPr>
+            <w:pStyle w:val="TOC1"/>
+            <w:tabs>
+              <w:tab w:val="right" w:leader="dot" w:pos="13948"/>
+            </w:tabs>
+            <w:rPr>
+              <w:rFonts w:asciiTheme="minorBidi" w:eastAsiaTheme="minorEastAsia" w:hAnsiTheme="minorBidi"/>
+              <w:noProof/>
+              <w:sz w:val="24"/>
+              <w:szCs w:val="24"/>
+              <w:lang w:eastAsia="en-GB"/>
+            </w:rPr>
+          </w:pPr>
+          <w:r>
+            <w:rPr>
+              <w:rFonts w:asciiTheme="minorBidi" w:hAnsiTheme="minorBidi"/>
+              <w:sz w:val="24"/>
+              <w:szCs w:val="24"/>
+            </w:rPr>
+            <w:fldChar w:fldCharType="begin"/>
+          </w:r>
+          <w:r>
+            <w:rPr>
+              <w:rFonts w:asciiTheme="minorBidi" w:hAnsiTheme="minorBidi"/>
+              <w:sz w:val="24"/>
+              <w:szCs w:val="24"/>
+            </w:rPr>
+            <w:instrText xml:space="preserve"> TOC \o "1-3" \h \z \u </w:instrText>
+          </w:r>
+          <w:r>
+            <w:rPr>
+              <w:rFonts w:asciiTheme="minorBidi" w:hAnsiTheme="minorBidi"/>
+              <w:sz w:val="24"/>
+              <w:szCs w:val="24"/>
+            </w:rPr>
+            <w:fldChar w:fldCharType="separate"/>
+          </w:r>
+          <w:hyperlink w:anchor="_Toc239617976" w:history="1">
+            <w:r>
+              <w:rPr>
+                <w:rStyle w:val="Hyperlink"/>
+                <w:rFonts w:asciiTheme="minorBidi" w:hAnsiTheme="minorBidi"/>
+                <w:noProof/>
+                <w:sz w:val="24"/>
+                <w:szCs w:val="24"/>
+              </w:rPr>
+              <w:t>INSTRUCTIONS</w:t>
+            </w:r>
+            <w:r>
+              <w:rPr>
+                <w:rFonts w:asciiTheme="minorBidi" w:hAnsiTheme="minorBidi"/>
+                <w:noProof/>
+                <w:webHidden/>
+                <w:sz w:val="24"/>
+                <w:szCs w:val="24"/>
+              </w:rPr>
+              <w:tab/>
+            </w:r>
+            <w:r>
+              <w:rPr>
+                <w:rFonts w:asciiTheme="minorBidi" w:hAnsiTheme="minorBidi"/>
+                <w:noProof/>
+                <w:webHidden/>
+                <w:sz w:val="24"/>
+                <w:szCs w:val="24"/>
+              </w:rPr>
+              <w:fldChar w:fldCharType="begin"/>
+            </w:r>
+            <w:r>
+              <w:rPr>
+                <w:rFonts w:asciiTheme="minorBidi" w:hAnsiTheme="minorBidi"/>
+                <w:noProof/>
+                <w:webHidden/>
+                <w:sz w:val="24"/>
+                <w:szCs w:val="24"/>
+              </w:rPr>
+              <w:instrText xml:space="preserve"> PAGEREF _Toc239617976 \h </w:instrText>
+            </w:r>
+            <w:r>
+              <w:rPr>
+                <w:rFonts w:asciiTheme="minorBidi" w:hAnsiTheme="minorBidi"/>
+                <w:noProof/>
+                <w:webHidden/>
+                <w:sz w:val="24"/>
+                <w:szCs w:val="24"/>
+              </w:rPr>
+            </w:r>
+            <w:r>
+              <w:rPr>
+                <w:rFonts w:asciiTheme="minorBidi" w:hAnsiTheme="minorBidi"/>
+                <w:noProof/>
+                <w:webHidden/>
+                <w:sz w:val="24"/>
+                <w:szCs w:val="24"/>
+              </w:rPr>
+              <w:fldChar w:fldCharType="separate"/>
+            </w:r>
+            <w:r>
+              <w:rPr>
+                <w:rFonts w:asciiTheme="minorBidi" w:hAnsiTheme="minorBidi"/>
+                <w:noProof/>
+                <w:webHidden/>
+                <w:sz w:val="24"/>
+                <w:szCs w:val="24"/>
+              </w:rPr>
+              <w:t>1</w:t>
+            </w:r>
+            <w:r>
+              <w:rPr>
+                <w:rFonts w:asciiTheme="minorBidi" w:hAnsiTheme="minorBidi"/>
+                <w:noProof/>
+                <w:webHidden/>
+                <w:sz w:val="24"/>
+                <w:szCs w:val="24"/>
+              </w:rPr>
+              <w:fldChar w:fldCharType="end"/>
+            </w:r>
+          </w:hyperlink>
+        </w:p>
+        <w:p>
+          <w:pPr>
+            <w:pStyle w:val="TOC2"/>
+            <w:rPr>
+              <w:rFonts w:eastAsiaTheme="minorEastAsia"/>
+              <w:lang w:eastAsia="en-GB"/>
+            </w:rPr>
+          </w:pPr>
+          <w:hyperlink w:anchor="_Toc239617977" w:history="1">
+            <w:r>
+              <w:rPr>
+                <w:rStyle w:val="Hyperlink"/>
+              </w:rPr>
+              <w:t>TABLE OF CONTENTS</w:t>
+            </w:r>
+            <w:r>
+              <w:rPr>
+                <w:webHidden/>
+              </w:rPr>
+              <w:tab/>
+            </w:r>
+            <w:r>
+              <w:rPr>
+                <w:webHidden/>
+              </w:rPr>
+              <w:fldChar w:fldCharType="begin"/>
+            </w:r>
+            <w:r>
+              <w:rPr>
+                <w:webHidden/>
+              </w:rPr>
+              <w:instrText xml:space="preserve"> PAGEREF _Toc239617977 \h </w:instrText>
+            </w:r>
+            <w:r>
+              <w:rPr>
+                <w:webHidden/>
+              </w:rPr>
+            </w:r>
+            <w:r>
+              <w:rPr>
+                <w:webHidden/>
+              </w:rPr>
+              <w:fldChar w:fldCharType="separate"/>
+            </w:r>
+            <w:r>
+              <w:rPr>
+                <w:webHidden/>
+              </w:rPr>
+              <w:t>1</w:t>
+            </w:r>
+            <w:r>
+              <w:rPr>
+                <w:webHidden/>
+              </w:rPr>
+              <w:fldChar w:fldCharType="end"/>
+            </w:r>
+          </w:hyperlink>
+        </w:p>
+        <w:p>
+          <w:pPr>
+            <w:pStyle w:val="TOC1"/>
+            <w:tabs>
+              <w:tab w:val="right" w:leader="dot" w:pos="13948"/>
+            </w:tabs>
+            <w:rPr>
+              <w:rFonts w:asciiTheme="minorBidi" w:eastAsiaTheme="minorEastAsia" w:hAnsiTheme="minorBidi"/>
+              <w:noProof/>
+              <w:sz w:val="24"/>
+              <w:szCs w:val="24"/>
+              <w:lang w:eastAsia="en-GB"/>
+            </w:rPr>
+          </w:pPr>
+          <w:hyperlink w:anchor="_Toc239617978" w:history="1">
+            <w:r>
+              <w:rPr>
+                <w:rStyle w:val="Hyperlink"/>
+                <w:rFonts w:asciiTheme="minorBidi" w:hAnsiTheme="minorBidi"/>
+                <w:noProof/>
+                <w:sz w:val="24"/>
+                <w:szCs w:val="24"/>
+              </w:rPr>
+              <w:t>STEPS FOR ONLY THE FIRST TIME</w:t>
+            </w:r>
+            <w:r>
+              <w:rPr>
+                <w:rFonts w:asciiTheme="minorBidi" w:hAnsiTheme="minorBidi"/>
+                <w:noProof/>
+                <w:webHidden/>
+                <w:sz w:val="24"/>
+                <w:szCs w:val="24"/>
+              </w:rPr>
+              <w:tab/>
+            </w:r>
+            <w:r>
+              <w:rPr>
+                <w:rFonts w:asciiTheme="minorBidi" w:hAnsiTheme="minorBidi"/>
+                <w:noProof/>
+                <w:webHidden/>
+                <w:sz w:val="24"/>
+                <w:szCs w:val="24"/>
+              </w:rPr>
+              <w:fldChar w:fldCharType="begin"/>
+            </w:r>
+            <w:r>
+              <w:rPr>
+                <w:rFonts w:asciiTheme="minorBidi" w:hAnsiTheme="minorBidi"/>
+                <w:noProof/>
+                <w:webHidden/>
+                <w:sz w:val="24"/>
+                <w:szCs w:val="24"/>
+              </w:rPr>
+              <w:instrText xml:space="preserve"> PAGEREF _Toc239617978 \h </w:instrText>
+            </w:r>
+            <w:r>
+              <w:rPr>
+                <w:rFonts w:asciiTheme="minorBidi" w:hAnsiTheme="minorBidi"/>
+                <w:noProof/>
+                <w:webHidden/>
+                <w:sz w:val="24"/>
+                <w:szCs w:val="24"/>
+              </w:rPr>
+            </w:r>
+            <w:r>
+              <w:rPr>
+                <w:rFonts w:asciiTheme="minorBidi" w:hAnsiTheme="minorBidi"/>
+                <w:noProof/>
+                <w:webHidden/>
+                <w:sz w:val="24"/>
+                <w:szCs w:val="24"/>
+              </w:rPr>
+              <w:fldChar w:fldCharType="separate"/>
+            </w:r>
+            <w:r>
+              <w:rPr>
+                <w:rFonts w:asciiTheme="minorBidi" w:hAnsiTheme="minorBidi"/>
+                <w:noProof/>
+                <w:webHidden/>
+                <w:sz w:val="24"/>
+                <w:szCs w:val="24"/>
+              </w:rPr>
+              <w:t>2</w:t>
+            </w:r>
+            <w:r>
+              <w:rPr>
+                <w:rFonts w:asciiTheme="minorBidi" w:hAnsiTheme="minorBidi"/>
+                <w:noProof/>
+                <w:webHidden/>
+                <w:sz w:val="24"/>
+                <w:szCs w:val="24"/>
+              </w:rPr>
+              <w:fldChar w:fldCharType="end"/>
+            </w:r>
+          </w:hyperlink>
+        </w:p>
+        <w:p>
+          <w:pPr>
+            <w:pStyle w:val="TOC1"/>
+            <w:tabs>
+              <w:tab w:val="right" w:leader="dot" w:pos="13948"/>
+            </w:tabs>
+            <w:rPr>
+              <w:rFonts w:asciiTheme="minorBidi" w:eastAsiaTheme="minorEastAsia" w:hAnsiTheme="minorBidi"/>
+              <w:noProof/>
+              <w:sz w:val="24"/>
+              <w:szCs w:val="24"/>
+              <w:lang w:eastAsia="en-GB"/>
+            </w:rPr>
+          </w:pPr>
+          <w:hyperlink w:anchor="_Toc239617979" w:history="1">
+            <w:r>
+              <w:rPr>
+                <w:rStyle w:val="Hyperlink"/>
+                <w:rFonts w:asciiTheme="minorBidi" w:hAnsiTheme="minorBidi"/>
+                <w:noProof/>
+                <w:sz w:val="24"/>
+                <w:szCs w:val="24"/>
+              </w:rPr>
+              <w:t>NORMAL APP USAGE</w:t>
+            </w:r>
+            <w:r>
+              <w:rPr>
+                <w:rFonts w:asciiTheme="minorBidi" w:hAnsiTheme="minorBidi"/>
+                <w:noProof/>
+                <w:webHidden/>
+                <w:sz w:val="24"/>
+                <w:szCs w:val="24"/>
+              </w:rPr>
+              <w:tab/>
+            </w:r>
+            <w:r>
+              <w:rPr>
+                <w:rFonts w:asciiTheme="minorBidi" w:hAnsiTheme="minorBidi"/>
+                <w:noProof/>
+                <w:webHidden/>
+                <w:sz w:val="24"/>
+                <w:szCs w:val="24"/>
+              </w:rPr>
+              <w:fldChar w:fldCharType="begin"/>
+            </w:r>
+            <w:r>
+              <w:rPr>
+                <w:rFonts w:asciiTheme="minorBidi" w:hAnsiTheme="minorBidi"/>
+                <w:noProof/>
+                <w:webHidden/>
+                <w:sz w:val="24"/>
+                <w:szCs w:val="24"/>
+              </w:rPr>
+              <w:instrText xml:space="preserve"> PAGEREF _Toc239617979 \h </w:instrText>
+            </w:r>
+            <w:r>
+              <w:rPr>
+                <w:rFonts w:asciiTheme="minorBidi" w:hAnsiTheme="minorBidi"/>
+                <w:noProof/>
+                <w:webHidden/>
+                <w:sz w:val="24"/>
+                <w:szCs w:val="24"/>
+              </w:rPr>
+            </w:r>
+            <w:r>
+              <w:rPr>
+                <w:rFonts w:asciiTheme="minorBidi" w:hAnsiTheme="minorBidi"/>
+                <w:noProof/>
+                <w:webHidden/>
+                <w:sz w:val="24"/>
+                <w:szCs w:val="24"/>
+              </w:rPr>
+              <w:fldChar w:fldCharType="separate"/>
+            </w:r>
+            <w:r>
+              <w:rPr>
+                <w:rFonts w:asciiTheme="minorBidi" w:hAnsiTheme="minorBidi"/>
+                <w:noProof/>
+                <w:webHidden/>
+                <w:sz w:val="24"/>
+                <w:szCs w:val="24"/>
+              </w:rPr>
+              <w:t>8</w:t>
+            </w:r>
+            <w:r>
+              <w:rPr>
+                <w:rFonts w:asciiTheme="minorBidi" w:hAnsiTheme="minorBidi"/>
+                <w:noProof/>
+                <w:webHidden/>
+                <w:sz w:val="24"/>
+                <w:szCs w:val="24"/>
+              </w:rPr>
+              <w:fldChar w:fldCharType="end"/>
+            </w:r>
+          </w:hyperlink>
+        </w:p>
+        <w:p>
+          <w:r>
+            <w:rPr>
+              <w:rFonts w:asciiTheme="minorBidi" w:hAnsiTheme="minorBidi"/>
+              <w:b/>
+              <w:bCs/>
+              <w:noProof/>
+              <w:sz w:val="24"/>
+              <w:szCs w:val="24"/>
+            </w:rPr>
+            <w:fldChar w:fldCharType="end"/>
+          </w:r>
+        </w:p>
+      </w:sdtContent>
+    </w:sdt>
+    <w:p>
+      <w:pPr>
+        <w:rPr>
+          <w:rFonts w:asciiTheme="minorBidi" w:hAnsiTheme="minorBidi"/>
+          <w:sz w:val="24"/>
+          <w:szCs w:val="24"/>
+        </w:rPr>
+      </w:pPr>
+    </w:p>
+    <w:p>
+      <w:pPr>
         <w:pStyle w:val="ListParagraph"/>
+        <w:tabs>
+          <w:tab w:val="left" w:pos="4931"/>
+        </w:tabs>
         <w:rPr>
           <w:rFonts w:asciiTheme="minorBidi" w:hAnsiTheme="minorBidi"/>
           <w:sz w:val="24"/>
           <w:szCs w:val="24"/>
         </w:rPr>
       </w:pPr>
-    </w:p>
-    <w:p>
-      <w:pPr>
-        <w:pStyle w:val="IntenseHeading"/>
+      <w:r>
+        <w:rPr>
+          <w:rFonts w:asciiTheme="minorBidi" w:hAnsiTheme="minorBidi"/>
+          <w:sz w:val="24"/>
+          <w:szCs w:val="24"/>
+        </w:rPr>
+        <w:tab/>
+      </w:r>
+    </w:p>
+    <w:p>
+      <w:pPr>
+        <w:rPr>
+          <w:rFonts w:ascii="Arial" w:hAnsi="Arial"/>
+          <w:b/>
+          <w:iCs/>
+          <w:color w:val="4472C4" w:themeColor="accent1"/>
+          <w:sz w:val="32"/>
+          <w:lang w:val="en-PK"/>
+        </w:rPr>
+      </w:pPr>
+      <w:r>
+        <w:br w:type="page"/>
+      </w:r>
+    </w:p>
+    <w:p>
+      <w:pPr>
+        <w:pStyle w:val="Heading1"/>
         <w:sectPr>
           <w:headerReference w:type="default" r:id="rId8"/>
           <w:footerReference w:type="default" r:id="rId9"/>
-          <w:pgSz w:w="11906" w:h="16838" w:code="9"/>
+          <w:pgSz w:w="16838" w:h="11906" w:orient="landscape" w:code="9"/>
           <w:pgMar w:top="720" w:right="720" w:bottom="720" w:left="2160" w:header="432" w:footer="432" w:gutter="0"/>
           <w:cols w:space="708"/>
           <w:docGrid w:linePitch="360"/>
         </w:sectPr>
       </w:pPr>
-      <w:r>
+      <w:bookmarkStart w:id="2" w:name="_Toc239617978"/>
+      <w:r>
+        <w:lastRenderedPageBreak/>
         <w:t xml:space="preserve">STEPS FOR </w:t>
       </w:r>
       <w:r>
         <w:t xml:space="preserve">ONLY </w:t>
       </w:r>
       <w:r>
-        <w:t xml:space="preserve">THE FIRST TIME </w:t>
+        <w:t>THE FIRST TIME</w:t>
+      </w:r>
+      <w:bookmarkEnd w:id="2"/>
+      <w:r>
+        <w:t xml:space="preserve"> </w:t>
       </w:r>
     </w:p>
     <w:p>
@@ -286,13 +771,13 @@
         <mc:AlternateContent>
           <mc:Choice Requires="wps">
             <w:drawing>
-              <wp:anchor distT="0" distB="0" distL="114300" distR="114300" simplePos="0" relativeHeight="251659264" behindDoc="0" locked="0" layoutInCell="1" allowOverlap="1" wp14:anchorId="50296F68" wp14:editId="6AE20D81">
+              <wp:anchor distT="0" distB="0" distL="114300" distR="114300" simplePos="0" relativeHeight="251659264" behindDoc="0" locked="0" layoutInCell="1" allowOverlap="1" wp14:anchorId="50296F68" wp14:editId="33DB2533">
                 <wp:simplePos x="0" y="0"/>
                 <wp:positionH relativeFrom="column">
-                  <wp:posOffset>523875</wp:posOffset>
+                  <wp:posOffset>1212215</wp:posOffset>
                 </wp:positionH>
                 <wp:positionV relativeFrom="paragraph">
-                  <wp:posOffset>1852930</wp:posOffset>
+                  <wp:posOffset>3907526</wp:posOffset>
                 </wp:positionV>
                 <wp:extent cx="457200" cy="466725"/>
                 <wp:effectExtent l="19050" t="19050" r="38100" b="47625"/>
@@ -351,7 +836,7 @@
           </mc:Choice>
           <mc:Fallback>
             <w:pict>
-              <v:roundrect w14:anchorId="5D3569FF" id="Rectangle: Rounded Corners 20" o:spid="_x0000_s1026" style="position:absolute;margin-left:41.25pt;margin-top:145.9pt;width:36pt;height:36.75pt;z-index:251659264;visibility:visible;mso-wrap-style:square;mso-height-percent:0;mso-wrap-distance-left:9pt;mso-wrap-distance-top:0;mso-wrap-distance-right:9pt;mso-wrap-distance-bottom:0;mso-position-horizontal:absolute;mso-position-horizontal-relative:text;mso-position-vertical:absolute;mso-position-vertical-relative:text;mso-height-percent:0;mso-height-relative:margin;v-text-anchor:middle" arcsize="10923f" o:gfxdata="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" filled="f" strokecolor="red" strokeweight="4.5pt">
+              <v:roundrect w14:anchorId="69A00923" id="Rectangle: Rounded Corners 20" o:spid="_x0000_s1026" style="position:absolute;margin-left:95.45pt;margin-top:307.7pt;width:36pt;height:36.75pt;z-index:251659264;visibility:visible;mso-wrap-style:square;mso-height-percent:0;mso-wrap-distance-left:9pt;mso-wrap-distance-top:0;mso-wrap-distance-right:9pt;mso-wrap-distance-bottom:0;mso-position-horizontal:absolute;mso-position-horizontal-relative:text;mso-position-vertical:absolute;mso-position-vertical-relative:text;mso-height-percent:0;mso-height-relative:margin;v-text-anchor:middle" arcsize="10923f" o:gfxdata="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" filled="f" strokecolor="red" strokeweight="4.5pt">
                 <v:stroke joinstyle="miter"/>
               </v:roundrect>
             </w:pict>
@@ -363,9 +848,9 @@
           <w:noProof/>
         </w:rPr>
         <w:drawing>
-          <wp:inline distT="0" distB="0" distL="0" distR="0" wp14:anchorId="2C50BE11" wp14:editId="4B288976">
-            <wp:extent cx="1826895" cy="3967983"/>
-            <wp:effectExtent l="0" t="0" r="1905" b="0"/>
+          <wp:inline distT="0" distB="0" distL="0" distR="0" wp14:anchorId="2C50BE11" wp14:editId="4E2C5A69">
+            <wp:extent cx="2154714" cy="4680000"/>
+            <wp:effectExtent l="0" t="0" r="0" b="6350"/>
             <wp:docPr id="7" name="Picture 7"/>
             <wp:cNvGraphicFramePr>
               <a:graphicFrameLocks xmlns:a="http://schemas.openxmlformats.org/drawingml/2006/main" noChangeAspect="1"/>
@@ -393,7 +878,7 @@
                   <pic:spPr bwMode="auto">
                     <a:xfrm>
                       <a:off x="0" y="0"/>
-                      <a:ext cx="1827752" cy="3969844"/>
+                      <a:ext cx="2154714" cy="4680000"/>
                     </a:xfrm>
                     <a:prstGeom prst="rect">
                       <a:avLst/>
@@ -494,13 +979,13 @@
         <mc:AlternateContent>
           <mc:Choice Requires="wps">
             <w:drawing>
-              <wp:anchor distT="0" distB="0" distL="114300" distR="114300" simplePos="0" relativeHeight="251667456" behindDoc="0" locked="0" layoutInCell="1" allowOverlap="1" wp14:anchorId="48E07368" wp14:editId="0D78276B">
+              <wp:anchor distT="0" distB="0" distL="114300" distR="114300" simplePos="0" relativeHeight="251667456" behindDoc="0" locked="0" layoutInCell="1" allowOverlap="1" wp14:anchorId="48E07368" wp14:editId="438AF11C">
                 <wp:simplePos x="0" y="0"/>
                 <wp:positionH relativeFrom="column">
-                  <wp:posOffset>1943100</wp:posOffset>
+                  <wp:posOffset>2840247</wp:posOffset>
                 </wp:positionH>
                 <wp:positionV relativeFrom="paragraph">
-                  <wp:posOffset>193040</wp:posOffset>
+                  <wp:posOffset>253425</wp:posOffset>
                 </wp:positionV>
                 <wp:extent cx="247650" cy="276225"/>
                 <wp:effectExtent l="19050" t="19050" r="38100" b="47625"/>
@@ -562,7 +1047,7 @@
           </mc:Choice>
           <mc:Fallback>
             <w:pict>
-              <v:roundrect w14:anchorId="525D0D0C" id="Rectangle: Rounded Corners 24" o:spid="_x0000_s1026" style="position:absolute;margin-left:153pt;margin-top:15.2pt;width:19.5pt;height:21.75pt;z-index:251667456;visibility:visible;mso-wrap-style:square;mso-width-percent:0;mso-height-percent:0;mso-wrap-distance-left:9pt;mso-wrap-distance-top:0;mso-wrap-distance-right:9pt;mso-wrap-distance-bottom:0;mso-position-horizontal:absolute;mso-position-horizontal-relative:text;mso-position-vertical:absolute;mso-position-vertical-relative:text;mso-width-percent:0;mso-height-percent:0;mso-width-relative:margin;mso-height-relative:margin;v-text-anchor:middle" arcsize="10923f" o:gfxdata="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" filled="f" strokecolor="red" strokeweight="4.5pt">
+              <v:roundrect w14:anchorId="61F80802" id="Rectangle: Rounded Corners 24" o:spid="_x0000_s1026" style="position:absolute;margin-left:223.65pt;margin-top:19.95pt;width:19.5pt;height:21.75pt;z-index:251667456;visibility:visible;mso-wrap-style:square;mso-width-percent:0;mso-height-percent:0;mso-wrap-distance-left:9pt;mso-wrap-distance-top:0;mso-wrap-distance-right:9pt;mso-wrap-distance-bottom:0;mso-position-horizontal:absolute;mso-position-horizontal-relative:text;mso-position-vertical:absolute;mso-position-vertical-relative:text;mso-width-percent:0;mso-height-percent:0;mso-width-relative:margin;mso-height-relative:margin;v-text-anchor:middle" arcsize="10923f" o:gfxdata="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" filled="f" strokecolor="red" strokeweight="4.5pt">
                 <v:stroke joinstyle="miter"/>
               </v:roundrect>
             </w:pict>
@@ -576,13 +1061,13 @@
         <mc:AlternateContent>
           <mc:Choice Requires="wps">
             <w:drawing>
-              <wp:anchor distT="0" distB="0" distL="114300" distR="114300" simplePos="0" relativeHeight="251669504" behindDoc="0" locked="0" layoutInCell="1" allowOverlap="1" wp14:anchorId="4E6FCA52" wp14:editId="4B85420F">
+              <wp:anchor distT="0" distB="0" distL="114300" distR="114300" simplePos="0" relativeHeight="251669504" behindDoc="0" locked="0" layoutInCell="1" allowOverlap="1" wp14:anchorId="4E6FCA52" wp14:editId="2FE4DDAB">
                 <wp:simplePos x="0" y="0"/>
                 <wp:positionH relativeFrom="column">
-                  <wp:posOffset>1447800</wp:posOffset>
+                  <wp:posOffset>2284466</wp:posOffset>
                 </wp:positionH>
                 <wp:positionV relativeFrom="paragraph">
-                  <wp:posOffset>3505201</wp:posOffset>
+                  <wp:posOffset>4171315</wp:posOffset>
                 </wp:positionV>
                 <wp:extent cx="447675" cy="421640"/>
                 <wp:effectExtent l="19050" t="19050" r="47625" b="35560"/>
@@ -644,7 +1129,7 @@
           </mc:Choice>
           <mc:Fallback>
             <w:pict>
-              <v:roundrect w14:anchorId="71D3F365" id="Rectangle: Rounded Corners 25" o:spid="_x0000_s1026" style="position:absolute;margin-left:114pt;margin-top:276pt;width:35.25pt;height:33.2pt;z-index:251669504;visibility:visible;mso-wrap-style:square;mso-width-percent:0;mso-height-percent:0;mso-wrap-distance-left:9pt;mso-wrap-distance-top:0;mso-wrap-distance-right:9pt;mso-wrap-distance-bottom:0;mso-position-horizontal:absolute;mso-position-horizontal-relative:text;mso-position-vertical:absolute;mso-position-vertical-relative:text;mso-width-percent:0;mso-height-percent:0;mso-width-relative:margin;mso-height-relative:margin;v-text-anchor:middle" arcsize="10923f" o:gfxdata="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" filled="f" strokecolor="red" strokeweight="4.5pt">
+              <v:roundrect w14:anchorId="68AEE00B" id="Rectangle: Rounded Corners 25" o:spid="_x0000_s1026" style="position:absolute;margin-left:179.9pt;margin-top:328.45pt;width:35.25pt;height:33.2pt;z-index:251669504;visibility:visible;mso-wrap-style:square;mso-width-percent:0;mso-height-percent:0;mso-wrap-distance-left:9pt;mso-wrap-distance-top:0;mso-wrap-distance-right:9pt;mso-wrap-distance-bottom:0;mso-position-horizontal:absolute;mso-position-horizontal-relative:text;mso-position-vertical:absolute;mso-position-vertical-relative:text;mso-width-percent:0;mso-height-percent:0;mso-width-relative:margin;mso-height-relative:margin;v-text-anchor:middle" arcsize="10923f" o:gfxdata="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" filled="f" strokecolor="red" strokeweight="4.5pt">
                 <v:stroke joinstyle="miter"/>
               </v:roundrect>
             </w:pict>
@@ -656,9 +1141,9 @@
           <w:noProof/>
         </w:rPr>
         <w:drawing>
-          <wp:inline distT="0" distB="0" distL="0" distR="0" wp14:anchorId="32C1719A" wp14:editId="422FF371">
-            <wp:extent cx="1827752" cy="3960000"/>
-            <wp:effectExtent l="0" t="0" r="1270" b="2540"/>
+          <wp:inline distT="0" distB="0" distL="0" distR="0" wp14:anchorId="32C1719A" wp14:editId="3CC72D89">
+            <wp:extent cx="2160071" cy="4680000"/>
+            <wp:effectExtent l="0" t="0" r="0" b="6350"/>
             <wp:docPr id="2" name="Picture 2"/>
             <wp:cNvGraphicFramePr>
               <a:graphicFrameLocks xmlns:a="http://schemas.openxmlformats.org/drawingml/2006/main" noChangeAspect="1"/>
@@ -688,7 +1173,7 @@
                   <pic:spPr bwMode="auto">
                     <a:xfrm>
                       <a:off x="0" y="0"/>
-                      <a:ext cx="1827752" cy="3960000"/>
+                      <a:ext cx="2160071" cy="4680000"/>
                     </a:xfrm>
                     <a:prstGeom prst="rect">
                       <a:avLst/>
@@ -866,13 +1351,13 @@
         <mc:AlternateContent>
           <mc:Choice Requires="wps">
             <w:drawing>
-              <wp:anchor distT="0" distB="0" distL="114300" distR="114300" simplePos="0" relativeHeight="251661312" behindDoc="0" locked="0" layoutInCell="1" allowOverlap="1" wp14:anchorId="62CCB561" wp14:editId="6ED99674">
+              <wp:anchor distT="0" distB="0" distL="114300" distR="114300" simplePos="0" relativeHeight="251661312" behindDoc="0" locked="0" layoutInCell="1" allowOverlap="1" wp14:anchorId="62CCB561" wp14:editId="2D35C030">
                 <wp:simplePos x="0" y="0"/>
                 <wp:positionH relativeFrom="column">
-                  <wp:posOffset>1014730</wp:posOffset>
+                  <wp:posOffset>1782481</wp:posOffset>
                 </wp:positionH>
                 <wp:positionV relativeFrom="paragraph">
-                  <wp:posOffset>167640</wp:posOffset>
+                  <wp:posOffset>245278</wp:posOffset>
                 </wp:positionV>
                 <wp:extent cx="447675" cy="276225"/>
                 <wp:effectExtent l="19050" t="19050" r="47625" b="47625"/>
@@ -934,7 +1419,7 @@
           </mc:Choice>
           <mc:Fallback>
             <w:pict>
-              <v:roundrect w14:anchorId="546E42DD" id="Rectangle: Rounded Corners 21" o:spid="_x0000_s1026" style="position:absolute;margin-left:79.9pt;margin-top:13.2pt;width:35.25pt;height:21.75pt;z-index:251661312;visibility:visible;mso-wrap-style:square;mso-width-percent:0;mso-height-percent:0;mso-wrap-distance-left:9pt;mso-wrap-distance-top:0;mso-wrap-distance-right:9pt;mso-wrap-distance-bottom:0;mso-position-horizontal:absolute;mso-position-horizontal-relative:text;mso-position-vertical:absolute;mso-position-vertical-relative:text;mso-width-percent:0;mso-height-percent:0;mso-width-relative:margin;mso-height-relative:margin;v-text-anchor:middle" arcsize="10923f" o:gfxdata="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" filled="f" strokecolor="red" strokeweight="4.5pt">
+              <v:roundrect w14:anchorId="2645C6C3" id="Rectangle: Rounded Corners 21" o:spid="_x0000_s1026" style="position:absolute;margin-left:140.35pt;margin-top:19.3pt;width:35.25pt;height:21.75pt;z-index:251661312;visibility:visible;mso-wrap-style:square;mso-width-percent:0;mso-height-percent:0;mso-wrap-distance-left:9pt;mso-wrap-distance-top:0;mso-wrap-distance-right:9pt;mso-wrap-distance-bottom:0;mso-position-horizontal:absolute;mso-position-horizontal-relative:text;mso-position-vertical:absolute;mso-position-vertical-relative:text;mso-width-percent:0;mso-height-percent:0;mso-width-relative:margin;mso-height-relative:margin;v-text-anchor:middle" arcsize="10923f" o:gfxdata="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" filled="f" strokecolor="red" strokeweight="4.5pt">
                 <v:stroke joinstyle="miter"/>
               </v:roundrect>
             </w:pict>
@@ -946,9 +1431,9 @@
           <w:noProof/>
         </w:rPr>
         <w:drawing>
-          <wp:inline distT="0" distB="0" distL="0" distR="0" wp14:anchorId="048B89CA" wp14:editId="520AD129">
-            <wp:extent cx="1827530" cy="3949700"/>
-            <wp:effectExtent l="0" t="0" r="1270" b="0"/>
+          <wp:inline distT="0" distB="0" distL="0" distR="0" wp14:anchorId="048B89CA" wp14:editId="6DE7C9EC">
+            <wp:extent cx="2165441" cy="4680000"/>
+            <wp:effectExtent l="0" t="0" r="6350" b="6350"/>
             <wp:docPr id="3" name="Picture 3"/>
             <wp:cNvGraphicFramePr>
               <a:graphicFrameLocks xmlns:a="http://schemas.openxmlformats.org/drawingml/2006/main" noChangeAspect="1"/>
@@ -976,7 +1461,7 @@
                   <pic:spPr bwMode="auto">
                     <a:xfrm>
                       <a:off x="0" y="0"/>
-                      <a:ext cx="1827752" cy="3950180"/>
+                      <a:ext cx="2165441" cy="4680000"/>
                     </a:xfrm>
                     <a:prstGeom prst="rect">
                       <a:avLst/>
@@ -1068,13 +1553,13 @@
         <mc:AlternateContent>
           <mc:Choice Requires="wps">
             <w:drawing>
-              <wp:anchor distT="0" distB="0" distL="114300" distR="114300" simplePos="0" relativeHeight="251663360" behindDoc="0" locked="0" layoutInCell="1" allowOverlap="1" wp14:anchorId="519B7BBD" wp14:editId="71CF67BE">
+              <wp:anchor distT="0" distB="0" distL="114300" distR="114300" simplePos="0" relativeHeight="251663360" behindDoc="0" locked="0" layoutInCell="1" allowOverlap="1" wp14:anchorId="519B7BBD" wp14:editId="1B4FAC79">
                 <wp:simplePos x="0" y="0"/>
                 <wp:positionH relativeFrom="column">
-                  <wp:posOffset>414655</wp:posOffset>
+                  <wp:posOffset>1043305</wp:posOffset>
                 </wp:positionH>
                 <wp:positionV relativeFrom="paragraph">
-                  <wp:posOffset>134620</wp:posOffset>
+                  <wp:posOffset>167904</wp:posOffset>
                 </wp:positionV>
                 <wp:extent cx="838200" cy="409575"/>
                 <wp:effectExtent l="19050" t="19050" r="38100" b="47625"/>
@@ -1136,7 +1621,7 @@
           </mc:Choice>
           <mc:Fallback>
             <w:pict>
-              <v:roundrect w14:anchorId="1DA5A08B" id="Rectangle: Rounded Corners 22" o:spid="_x0000_s1026" style="position:absolute;margin-left:32.65pt;margin-top:10.6pt;width:66pt;height:32.25pt;z-index:251663360;visibility:visible;mso-wrap-style:square;mso-width-percent:0;mso-height-percent:0;mso-wrap-distance-left:9pt;mso-wrap-distance-top:0;mso-wrap-distance-right:9pt;mso-wrap-distance-bottom:0;mso-position-horizontal:absolute;mso-position-horizontal-relative:text;mso-position-vertical:absolute;mso-position-vertical-relative:text;mso-width-percent:0;mso-height-percent:0;mso-width-relative:margin;mso-height-relative:margin;v-text-anchor:middle" arcsize="10923f" o:gfxdata="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" filled="f" strokecolor="red" strokeweight="4.5pt">
+              <v:roundrect w14:anchorId="0730EF2B" id="Rectangle: Rounded Corners 22" o:spid="_x0000_s1026" style="position:absolute;margin-left:82.15pt;margin-top:13.2pt;width:66pt;height:32.25pt;z-index:251663360;visibility:visible;mso-wrap-style:square;mso-width-percent:0;mso-height-percent:0;mso-wrap-distance-left:9pt;mso-wrap-distance-top:0;mso-wrap-distance-right:9pt;mso-wrap-distance-bottom:0;mso-position-horizontal:absolute;mso-position-horizontal-relative:text;mso-position-vertical:absolute;mso-position-vertical-relative:text;mso-width-percent:0;mso-height-percent:0;mso-width-relative:margin;mso-height-relative:margin;v-text-anchor:middle" arcsize="10923f" o:gfxdata="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" filled="f" strokecolor="red" strokeweight="4.5pt">
                 <v:stroke joinstyle="miter"/>
               </v:roundrect>
             </w:pict>
@@ -1148,9 +1633,9 @@
           <w:noProof/>
         </w:rPr>
         <w:drawing>
-          <wp:inline distT="0" distB="0" distL="0" distR="0" wp14:anchorId="0E408943" wp14:editId="5CDE8FDA">
-            <wp:extent cx="1827752" cy="3960000"/>
-            <wp:effectExtent l="0" t="0" r="1270" b="2540"/>
+          <wp:inline distT="0" distB="0" distL="0" distR="0" wp14:anchorId="0E408943" wp14:editId="49222D08">
+            <wp:extent cx="2160071" cy="4680000"/>
+            <wp:effectExtent l="0" t="0" r="0" b="6350"/>
             <wp:docPr id="4" name="Picture 4"/>
             <wp:cNvGraphicFramePr>
               <a:graphicFrameLocks xmlns:a="http://schemas.openxmlformats.org/drawingml/2006/main" noChangeAspect="1"/>
@@ -1180,7 +1665,7 @@
                   <pic:spPr bwMode="auto">
                     <a:xfrm>
                       <a:off x="0" y="0"/>
-                      <a:ext cx="1827752" cy="3960000"/>
+                      <a:ext cx="2160071" cy="4680000"/>
                     </a:xfrm>
                     <a:prstGeom prst="rect">
                       <a:avLst/>
@@ -1251,16 +1736,17 @@
         <w:rPr>
           <w:noProof/>
         </w:rPr>
+        <w:lastRenderedPageBreak/>
         <mc:AlternateContent>
           <mc:Choice Requires="wps">
             <w:drawing>
-              <wp:anchor distT="0" distB="0" distL="114300" distR="114300" simplePos="0" relativeHeight="251665408" behindDoc="0" locked="0" layoutInCell="1" allowOverlap="1" wp14:anchorId="4629D531" wp14:editId="04EEC284">
+              <wp:anchor distT="0" distB="0" distL="114300" distR="114300" simplePos="0" relativeHeight="251665408" behindDoc="0" locked="0" layoutInCell="1" allowOverlap="1" wp14:anchorId="4629D531" wp14:editId="1C334A06">
                 <wp:simplePos x="0" y="0"/>
                 <wp:positionH relativeFrom="column">
-                  <wp:posOffset>1200150</wp:posOffset>
+                  <wp:posOffset>2038350</wp:posOffset>
                 </wp:positionH>
                 <wp:positionV relativeFrom="paragraph">
-                  <wp:posOffset>3562350</wp:posOffset>
+                  <wp:posOffset>4209332</wp:posOffset>
                 </wp:positionV>
                 <wp:extent cx="838200" cy="247650"/>
                 <wp:effectExtent l="19050" t="19050" r="38100" b="38100"/>
@@ -1322,7 +1808,7 @@
           </mc:Choice>
           <mc:Fallback>
             <w:pict>
-              <v:roundrect w14:anchorId="6A4FE8EA" id="Rectangle: Rounded Corners 23" o:spid="_x0000_s1026" style="position:absolute;margin-left:94.5pt;margin-top:280.5pt;width:66pt;height:19.5pt;z-index:251665408;visibility:visible;mso-wrap-style:square;mso-width-percent:0;mso-height-percent:0;mso-wrap-distance-left:9pt;mso-wrap-distance-top:0;mso-wrap-distance-right:9pt;mso-wrap-distance-bottom:0;mso-position-horizontal:absolute;mso-position-horizontal-relative:text;mso-position-vertical:absolute;mso-position-vertical-relative:text;mso-width-percent:0;mso-height-percent:0;mso-width-relative:margin;mso-height-relative:margin;v-text-anchor:middle" arcsize="10923f" o:gfxdata="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" filled="f" strokecolor="red" strokeweight="4.5pt">
+              <v:roundrect w14:anchorId="3ADAADED" id="Rectangle: Rounded Corners 23" o:spid="_x0000_s1026" style="position:absolute;margin-left:160.5pt;margin-top:331.45pt;width:66pt;height:19.5pt;z-index:251665408;visibility:visible;mso-wrap-style:square;mso-width-percent:0;mso-height-percent:0;mso-wrap-distance-left:9pt;mso-wrap-distance-top:0;mso-wrap-distance-right:9pt;mso-wrap-distance-bottom:0;mso-position-horizontal:absolute;mso-position-horizontal-relative:text;mso-position-vertical:absolute;mso-position-vertical-relative:text;mso-width-percent:0;mso-height-percent:0;mso-width-relative:margin;mso-height-relative:margin;v-text-anchor:middle" arcsize="10923f" o:gfxdata="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" filled="f" strokecolor="red" strokeweight="4.5pt">
                 <v:stroke joinstyle="miter"/>
               </v:roundrect>
             </w:pict>
@@ -1334,9 +1820,9 @@
           <w:noProof/>
         </w:rPr>
         <w:drawing>
-          <wp:inline distT="0" distB="0" distL="0" distR="0" wp14:anchorId="6EAD9F5F" wp14:editId="15C7EF02">
-            <wp:extent cx="1827751" cy="3960000"/>
-            <wp:effectExtent l="0" t="0" r="1270" b="2540"/>
+          <wp:inline distT="0" distB="0" distL="0" distR="0" wp14:anchorId="6EAD9F5F" wp14:editId="06AC0D02">
+            <wp:extent cx="2160069" cy="4680000"/>
+            <wp:effectExtent l="0" t="0" r="0" b="6350"/>
             <wp:docPr id="5" name="Picture 5"/>
             <wp:cNvGraphicFramePr>
               <a:graphicFrameLocks xmlns:a="http://schemas.openxmlformats.org/drawingml/2006/main" noChangeAspect="1"/>
@@ -1366,7 +1852,7 @@
                   <pic:spPr bwMode="auto">
                     <a:xfrm>
                       <a:off x="0" y="0"/>
-                      <a:ext cx="1827751" cy="3960000"/>
+                      <a:ext cx="2160069" cy="4680000"/>
                     </a:xfrm>
                     <a:prstGeom prst="rect">
                       <a:avLst/>
@@ -1450,9 +1936,9 @@
           <w:noProof/>
         </w:rPr>
         <w:drawing>
-          <wp:inline distT="0" distB="0" distL="0" distR="0" wp14:anchorId="26B45456" wp14:editId="69169547">
-            <wp:extent cx="1827752" cy="3960000"/>
-            <wp:effectExtent l="0" t="0" r="1270" b="2540"/>
+          <wp:inline distT="0" distB="0" distL="0" distR="0" wp14:anchorId="26B45456" wp14:editId="377D14F2">
+            <wp:extent cx="2160071" cy="4680000"/>
+            <wp:effectExtent l="0" t="0" r="0" b="6350"/>
             <wp:docPr id="6" name="Picture 6"/>
             <wp:cNvGraphicFramePr>
               <a:graphicFrameLocks xmlns:a="http://schemas.openxmlformats.org/drawingml/2006/main" noChangeAspect="1"/>
@@ -1482,7 +1968,7 @@
                   <pic:spPr bwMode="auto">
                     <a:xfrm>
                       <a:off x="0" y="0"/>
-                      <a:ext cx="1827752" cy="3960000"/>
+                      <a:ext cx="2160071" cy="4680000"/>
                     </a:xfrm>
                     <a:prstGeom prst="rect">
                       <a:avLst/>
@@ -1536,10 +2022,11 @@
         <w:rPr>
           <w:noProof/>
         </w:rPr>
+        <w:lastRenderedPageBreak/>
         <w:drawing>
-          <wp:inline distT="0" distB="0" distL="0" distR="0" wp14:anchorId="134A6D37" wp14:editId="6C3BC830">
-            <wp:extent cx="1827752" cy="3960000"/>
-            <wp:effectExtent l="0" t="0" r="1270" b="2540"/>
+          <wp:inline distT="0" distB="0" distL="0" distR="0" wp14:anchorId="134A6D37" wp14:editId="1E61E09A">
+            <wp:extent cx="2160071" cy="4680000"/>
+            <wp:effectExtent l="0" t="0" r="0" b="6350"/>
             <wp:docPr id="1" name="Picture 1"/>
             <wp:cNvGraphicFramePr>
               <a:graphicFrameLocks xmlns:a="http://schemas.openxmlformats.org/drawingml/2006/main" noChangeAspect="1"/>
@@ -1569,7 +2056,7 @@
                   <pic:spPr bwMode="auto">
                     <a:xfrm>
                       <a:off x="0" y="0"/>
-                      <a:ext cx="1827752" cy="3960000"/>
+                      <a:ext cx="2160071" cy="4680000"/>
                     </a:xfrm>
                     <a:prstGeom prst="rect">
                       <a:avLst/>
@@ -1643,16 +2130,16 @@
         <mc:AlternateContent>
           <mc:Choice Requires="wps">
             <w:drawing>
-              <wp:anchor distT="0" distB="0" distL="114300" distR="114300" simplePos="0" relativeHeight="251671552" behindDoc="0" locked="0" layoutInCell="1" allowOverlap="1" wp14:anchorId="78725BF9" wp14:editId="459DB47B">
+              <wp:anchor distT="0" distB="0" distL="114300" distR="114300" simplePos="0" relativeHeight="251671552" behindDoc="0" locked="0" layoutInCell="1" allowOverlap="1" wp14:anchorId="78725BF9" wp14:editId="2DDAF69C">
                 <wp:simplePos x="0" y="0"/>
                 <wp:positionH relativeFrom="column">
-                  <wp:posOffset>1719580</wp:posOffset>
+                  <wp:posOffset>2606987</wp:posOffset>
                 </wp:positionH>
                 <wp:positionV relativeFrom="paragraph">
-                  <wp:posOffset>1332865</wp:posOffset>
+                  <wp:posOffset>3079631</wp:posOffset>
                 </wp:positionV>
-                <wp:extent cx="457200" cy="466725"/>
-                <wp:effectExtent l="19050" t="19050" r="38100" b="47625"/>
+                <wp:extent cx="484876" cy="537534"/>
+                <wp:effectExtent l="19050" t="19050" r="29845" b="34290"/>
                 <wp:wrapNone/>
                 <wp:docPr id="26" name="Rectangle: Rounded Corners 26"/>
                 <wp:cNvGraphicFramePr/>
@@ -1663,7 +2150,7 @@
                       <wps:spPr>
                         <a:xfrm>
                           <a:off x="0" y="0"/>
-                          <a:ext cx="457200" cy="466725"/>
+                          <a:ext cx="484876" cy="537534"/>
                         </a:xfrm>
                         <a:prstGeom prst="roundRect">
                           <a:avLst/>
@@ -1700,6 +2187,9 @@
                     </wps:wsp>
                   </a:graphicData>
                 </a:graphic>
+                <wp14:sizeRelH relativeFrom="margin">
+                  <wp14:pctWidth>0</wp14:pctWidth>
+                </wp14:sizeRelH>
                 <wp14:sizeRelV relativeFrom="margin">
                   <wp14:pctHeight>0</wp14:pctHeight>
                 </wp14:sizeRelV>
@@ -1708,7 +2198,7 @@
           </mc:Choice>
           <mc:Fallback>
             <w:pict>
-              <v:roundrect w14:anchorId="78DE5325" id="Rectangle: Rounded Corners 26" o:spid="_x0000_s1026" style="position:absolute;margin-left:135.4pt;margin-top:104.95pt;width:36pt;height:36.75pt;z-index:251671552;visibility:visible;mso-wrap-style:square;mso-height-percent:0;mso-wrap-distance-left:9pt;mso-wrap-distance-top:0;mso-wrap-distance-right:9pt;mso-wrap-distance-bottom:0;mso-position-horizontal:absolute;mso-position-horizontal-relative:text;mso-position-vertical:absolute;mso-position-vertical-relative:text;mso-height-percent:0;mso-height-relative:margin;v-text-anchor:middle" arcsize="10923f" o:gfxdata="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" filled="f" strokecolor="red" strokeweight="4.5pt">
+              <v:roundrect w14:anchorId="397904BD" id="Rectangle: Rounded Corners 26" o:spid="_x0000_s1026" style="position:absolute;margin-left:205.25pt;margin-top:242.5pt;width:38.2pt;height:42.35pt;z-index:251671552;visibility:visible;mso-wrap-style:square;mso-width-percent:0;mso-height-percent:0;mso-wrap-distance-left:9pt;mso-wrap-distance-top:0;mso-wrap-distance-right:9pt;mso-wrap-distance-bottom:0;mso-position-horizontal:absolute;mso-position-horizontal-relative:text;mso-position-vertical:absolute;mso-position-vertical-relative:text;mso-width-percent:0;mso-height-percent:0;mso-width-relative:margin;mso-height-relative:margin;v-text-anchor:middle" arcsize="10923f" o:gfxdata="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" filled="f" strokecolor="red" strokeweight="4.5pt">
                 <v:stroke joinstyle="miter"/>
               </v:roundrect>
             </w:pict>
@@ -1720,9 +2210,9 @@
           <w:noProof/>
         </w:rPr>
         <w:drawing>
-          <wp:inline distT="0" distB="0" distL="0" distR="0" wp14:anchorId="6237B319" wp14:editId="1880833A">
-            <wp:extent cx="1826895" cy="3949224"/>
-            <wp:effectExtent l="0" t="0" r="1905" b="0"/>
+          <wp:inline distT="0" distB="0" distL="0" distR="0" wp14:anchorId="6237B319" wp14:editId="291AAEA6">
+            <wp:extent cx="2164949" cy="4680000"/>
+            <wp:effectExtent l="0" t="0" r="6985" b="6350"/>
             <wp:docPr id="14" name="Picture 14"/>
             <wp:cNvGraphicFramePr>
               <a:graphicFrameLocks xmlns:a="http://schemas.openxmlformats.org/drawingml/2006/main" noChangeAspect="1"/>
@@ -1750,7 +2240,7 @@
                   <pic:spPr bwMode="auto">
                     <a:xfrm>
                       <a:off x="0" y="0"/>
-                      <a:ext cx="1827530" cy="3950597"/>
+                      <a:ext cx="2164949" cy="4680000"/>
                     </a:xfrm>
                     <a:prstGeom prst="rect">
                       <a:avLst/>
@@ -1833,16 +2323,17 @@
         <w:rPr>
           <w:noProof/>
         </w:rPr>
+        <w:lastRenderedPageBreak/>
         <mc:AlternateContent>
           <mc:Choice Requires="wps">
             <w:drawing>
-              <wp:anchor distT="0" distB="0" distL="114300" distR="114300" simplePos="0" relativeHeight="251677696" behindDoc="0" locked="0" layoutInCell="1" allowOverlap="1" wp14:anchorId="478AE9CE" wp14:editId="4B3FE762">
+              <wp:anchor distT="0" distB="0" distL="114300" distR="114300" simplePos="0" relativeHeight="251677696" behindDoc="0" locked="0" layoutInCell="1" allowOverlap="1" wp14:anchorId="478AE9CE" wp14:editId="759B1BC8">
                 <wp:simplePos x="0" y="0"/>
                 <wp:positionH relativeFrom="column">
-                  <wp:posOffset>981075</wp:posOffset>
+                  <wp:posOffset>1766079</wp:posOffset>
                 </wp:positionH>
                 <wp:positionV relativeFrom="paragraph">
-                  <wp:posOffset>3228975</wp:posOffset>
+                  <wp:posOffset>3824198</wp:posOffset>
                 </wp:positionV>
                 <wp:extent cx="666750" cy="276225"/>
                 <wp:effectExtent l="19050" t="19050" r="38100" b="47625"/>
@@ -1904,7 +2395,7 @@
           </mc:Choice>
           <mc:Fallback>
             <w:pict>
-              <v:roundrect w14:anchorId="25F7316D" id="Rectangle: Rounded Corners 29" o:spid="_x0000_s1026" style="position:absolute;margin-left:77.25pt;margin-top:254.25pt;width:52.5pt;height:21.75pt;z-index:251677696;visibility:visible;mso-wrap-style:square;mso-width-percent:0;mso-height-percent:0;mso-wrap-distance-left:9pt;mso-wrap-distance-top:0;mso-wrap-distance-right:9pt;mso-wrap-distance-bottom:0;mso-position-horizontal:absolute;mso-position-horizontal-relative:text;mso-position-vertical:absolute;mso-position-vertical-relative:text;mso-width-percent:0;mso-height-percent:0;mso-width-relative:margin;mso-height-relative:margin;v-text-anchor:middle" arcsize="10923f" o:gfxdata="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" filled="f" strokecolor="red" strokeweight="4.5pt">
+              <v:roundrect w14:anchorId="7870D335" id="Rectangle: Rounded Corners 29" o:spid="_x0000_s1026" style="position:absolute;margin-left:139.05pt;margin-top:301.1pt;width:52.5pt;height:21.75pt;z-index:251677696;visibility:visible;mso-wrap-style:square;mso-width-percent:0;mso-height-percent:0;mso-wrap-distance-left:9pt;mso-wrap-distance-top:0;mso-wrap-distance-right:9pt;mso-wrap-distance-bottom:0;mso-position-horizontal:absolute;mso-position-horizontal-relative:text;mso-position-vertical:absolute;mso-position-vertical-relative:text;mso-width-percent:0;mso-height-percent:0;mso-width-relative:margin;mso-height-relative:margin;v-text-anchor:middle" arcsize="10923f" o:gfxdata="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" filled="f" strokecolor="red" strokeweight="4.5pt">
                 <v:stroke joinstyle="miter"/>
               </v:roundrect>
             </w:pict>
@@ -1916,9 +2407,9 @@
           <w:noProof/>
         </w:rPr>
         <w:drawing>
-          <wp:inline distT="0" distB="0" distL="0" distR="0" wp14:anchorId="24E261F9" wp14:editId="0F63E247">
-            <wp:extent cx="1827489" cy="3960000"/>
-            <wp:effectExtent l="0" t="0" r="1905" b="2540"/>
+          <wp:inline distT="0" distB="0" distL="0" distR="0" wp14:anchorId="24E261F9" wp14:editId="67F7F7CB">
+            <wp:extent cx="2159760" cy="4680000"/>
+            <wp:effectExtent l="0" t="0" r="0" b="6350"/>
             <wp:docPr id="36" name="Picture 36"/>
             <wp:cNvGraphicFramePr>
               <a:graphicFrameLocks xmlns:a="http://schemas.openxmlformats.org/drawingml/2006/main" noChangeAspect="1"/>
@@ -1948,7 +2439,7 @@
                   <pic:spPr bwMode="auto">
                     <a:xfrm>
                       <a:off x="0" y="0"/>
-                      <a:ext cx="1827489" cy="3960000"/>
+                      <a:ext cx="2159760" cy="4680000"/>
                     </a:xfrm>
                     <a:prstGeom prst="rect">
                       <a:avLst/>
@@ -2020,16 +2511,16 @@
         <mc:AlternateContent>
           <mc:Choice Requires="wps">
             <w:drawing>
-              <wp:anchor distT="0" distB="0" distL="114300" distR="114300" simplePos="0" relativeHeight="251685888" behindDoc="0" locked="0" layoutInCell="1" allowOverlap="1" wp14:anchorId="26590255" wp14:editId="7B543BB5">
+              <wp:anchor distT="0" distB="0" distL="114300" distR="114300" simplePos="0" relativeHeight="251685888" behindDoc="0" locked="0" layoutInCell="1" allowOverlap="1" wp14:anchorId="26590255" wp14:editId="7CF36484">
                 <wp:simplePos x="0" y="0"/>
                 <wp:positionH relativeFrom="column">
-                  <wp:posOffset>749205</wp:posOffset>
+                  <wp:posOffset>1470097</wp:posOffset>
                 </wp:positionH>
                 <wp:positionV relativeFrom="paragraph">
-                  <wp:posOffset>2224974</wp:posOffset>
+                  <wp:posOffset>2658733</wp:posOffset>
                 </wp:positionV>
-                <wp:extent cx="1359374" cy="226609"/>
-                <wp:effectExtent l="19050" t="19050" r="31750" b="40640"/>
+                <wp:extent cx="1525078" cy="226609"/>
+                <wp:effectExtent l="19050" t="19050" r="37465" b="40640"/>
                 <wp:wrapNone/>
                 <wp:docPr id="35" name="Rectangle: Rounded Corners 35"/>
                 <wp:cNvGraphicFramePr/>
@@ -2040,7 +2531,7 @@
                       <wps:spPr>
                         <a:xfrm>
                           <a:off x="0" y="0"/>
-                          <a:ext cx="1359374" cy="226609"/>
+                          <a:ext cx="1525078" cy="226609"/>
                         </a:xfrm>
                         <a:prstGeom prst="roundRect">
                           <a:avLst/>
@@ -2088,7 +2579,7 @@
           </mc:Choice>
           <mc:Fallback>
             <w:pict>
-              <v:roundrect w14:anchorId="602E728B" id="Rectangle: Rounded Corners 35" o:spid="_x0000_s1026" style="position:absolute;margin-left:59pt;margin-top:175.2pt;width:107.05pt;height:17.85pt;z-index:251685888;visibility:visible;mso-wrap-style:square;mso-width-percent:0;mso-height-percent:0;mso-wrap-distance-left:9pt;mso-wrap-distance-top:0;mso-wrap-distance-right:9pt;mso-wrap-distance-bottom:0;mso-position-horizontal:absolute;mso-position-horizontal-relative:text;mso-position-vertical:absolute;mso-position-vertical-relative:text;mso-width-percent:0;mso-height-percent:0;mso-width-relative:margin;mso-height-relative:margin;v-text-anchor:middle" arcsize="10923f" o:gfxdata="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" filled="f" strokecolor="red" strokeweight="4.5pt">
+              <v:roundrect w14:anchorId="7BC85D95" id="Rectangle: Rounded Corners 35" o:spid="_x0000_s1026" style="position:absolute;margin-left:115.75pt;margin-top:209.35pt;width:120.1pt;height:17.85pt;z-index:251685888;visibility:visible;mso-wrap-style:square;mso-width-percent:0;mso-height-percent:0;mso-wrap-distance-left:9pt;mso-wrap-distance-top:0;mso-wrap-distance-right:9pt;mso-wrap-distance-bottom:0;mso-position-horizontal:absolute;mso-position-horizontal-relative:text;mso-position-vertical:absolute;mso-position-vertical-relative:text;mso-width-percent:0;mso-height-percent:0;mso-width-relative:margin;mso-height-relative:margin;v-text-anchor:middle" arcsize="10923f" o:gfxdata="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" filled="f" strokecolor="red" strokeweight="4.5pt">
                 <v:stroke joinstyle="miter"/>
               </v:roundrect>
             </w:pict>
@@ -2100,9 +2591,9 @@
           <w:noProof/>
         </w:rPr>
         <w:drawing>
-          <wp:inline distT="0" distB="0" distL="0" distR="0" wp14:anchorId="2651AF41" wp14:editId="1C1D7D09">
-            <wp:extent cx="1827489" cy="3960000"/>
-            <wp:effectExtent l="0" t="0" r="1905" b="2540"/>
+          <wp:inline distT="0" distB="0" distL="0" distR="0" wp14:anchorId="2651AF41" wp14:editId="54CEA36E">
+            <wp:extent cx="2159760" cy="4680000"/>
+            <wp:effectExtent l="0" t="0" r="0" b="6350"/>
             <wp:docPr id="12" name="Picture 12"/>
             <wp:cNvGraphicFramePr>
               <a:graphicFrameLocks xmlns:a="http://schemas.openxmlformats.org/drawingml/2006/main" noChangeAspect="1"/>
@@ -2132,7 +2623,7 @@
                   <pic:spPr bwMode="auto">
                     <a:xfrm>
                       <a:off x="0" y="0"/>
-                      <a:ext cx="1827489" cy="3960000"/>
+                      <a:ext cx="2159760" cy="4680000"/>
                     </a:xfrm>
                     <a:prstGeom prst="rect">
                       <a:avLst/>
@@ -2207,13 +2698,13 @@
         <mc:AlternateContent>
           <mc:Choice Requires="wps">
             <w:drawing>
-              <wp:anchor distT="0" distB="0" distL="114300" distR="114300" simplePos="0" relativeHeight="251679744" behindDoc="0" locked="0" layoutInCell="1" allowOverlap="1" wp14:anchorId="0C46BC45" wp14:editId="52345659">
+              <wp:anchor distT="0" distB="0" distL="114300" distR="114300" simplePos="0" relativeHeight="251679744" behindDoc="0" locked="0" layoutInCell="1" allowOverlap="1" wp14:anchorId="0C46BC45" wp14:editId="1623AB6E">
                 <wp:simplePos x="0" y="0"/>
                 <wp:positionH relativeFrom="column">
-                  <wp:posOffset>1557655</wp:posOffset>
+                  <wp:posOffset>2421255</wp:posOffset>
                 </wp:positionH>
                 <wp:positionV relativeFrom="paragraph">
-                  <wp:posOffset>3514725</wp:posOffset>
+                  <wp:posOffset>4177294</wp:posOffset>
                 </wp:positionV>
                 <wp:extent cx="333375" cy="304800"/>
                 <wp:effectExtent l="19050" t="19050" r="47625" b="38100"/>
@@ -2275,7 +2766,7 @@
           </mc:Choice>
           <mc:Fallback>
             <w:pict>
-              <v:roundrect w14:anchorId="16BD53CA" id="Rectangle: Rounded Corners 30" o:spid="_x0000_s1026" style="position:absolute;margin-left:122.65pt;margin-top:276.75pt;width:26.25pt;height:24pt;z-index:251679744;visibility:visible;mso-wrap-style:square;mso-width-percent:0;mso-height-percent:0;mso-wrap-distance-left:9pt;mso-wrap-distance-top:0;mso-wrap-distance-right:9pt;mso-wrap-distance-bottom:0;mso-position-horizontal:absolute;mso-position-horizontal-relative:text;mso-position-vertical:absolute;mso-position-vertical-relative:text;mso-width-percent:0;mso-height-percent:0;mso-width-relative:margin;mso-height-relative:margin;v-text-anchor:middle" arcsize="10923f" o:gfxdata="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" filled="f" strokecolor="red" strokeweight="4.5pt">
+              <v:roundrect w14:anchorId="55AAAED0" id="Rectangle: Rounded Corners 30" o:spid="_x0000_s1026" style="position:absolute;margin-left:190.65pt;margin-top:328.9pt;width:26.25pt;height:24pt;z-index:251679744;visibility:visible;mso-wrap-style:square;mso-width-percent:0;mso-height-percent:0;mso-wrap-distance-left:9pt;mso-wrap-distance-top:0;mso-wrap-distance-right:9pt;mso-wrap-distance-bottom:0;mso-position-horizontal:absolute;mso-position-horizontal-relative:text;mso-position-vertical:absolute;mso-position-vertical-relative:text;mso-width-percent:0;mso-height-percent:0;mso-width-relative:margin;mso-height-relative:margin;v-text-anchor:middle" arcsize="10923f" o:gfxdata="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" filled="f" strokecolor="red" strokeweight="4.5pt">
                 <v:stroke joinstyle="miter"/>
               </v:roundrect>
             </w:pict>
@@ -2287,9 +2778,9 @@
           <w:noProof/>
         </w:rPr>
         <w:drawing>
-          <wp:inline distT="0" distB="0" distL="0" distR="0" wp14:anchorId="795F900F" wp14:editId="56E8C28E">
-            <wp:extent cx="1827489" cy="3960000"/>
-            <wp:effectExtent l="0" t="0" r="1905" b="2540"/>
+          <wp:inline distT="0" distB="0" distL="0" distR="0" wp14:anchorId="795F900F" wp14:editId="721AA39F">
+            <wp:extent cx="2159760" cy="4680000"/>
+            <wp:effectExtent l="0" t="0" r="0" b="6350"/>
             <wp:docPr id="37" name="Picture 37"/>
             <wp:cNvGraphicFramePr>
               <a:graphicFrameLocks xmlns:a="http://schemas.openxmlformats.org/drawingml/2006/main" noChangeAspect="1"/>
@@ -2319,7 +2810,7 @@
                   <pic:spPr bwMode="auto">
                     <a:xfrm>
                       <a:off x="0" y="0"/>
-                      <a:ext cx="1827489" cy="3960000"/>
+                      <a:ext cx="2159760" cy="4680000"/>
                     </a:xfrm>
                     <a:prstGeom prst="rect">
                       <a:avLst/>
@@ -2392,13 +2883,13 @@
         <mc:AlternateContent>
           <mc:Choice Requires="wps">
             <w:drawing>
-              <wp:anchor distT="0" distB="0" distL="114300" distR="114300" simplePos="0" relativeHeight="251681792" behindDoc="0" locked="0" layoutInCell="1" allowOverlap="1" wp14:anchorId="06BF385A" wp14:editId="1E8D84B7">
+              <wp:anchor distT="0" distB="0" distL="114300" distR="114300" simplePos="0" relativeHeight="251681792" behindDoc="0" locked="0" layoutInCell="1" allowOverlap="1" wp14:anchorId="06BF385A" wp14:editId="2130DCAF">
                 <wp:simplePos x="0" y="0"/>
                 <wp:positionH relativeFrom="column">
-                  <wp:posOffset>1643380</wp:posOffset>
+                  <wp:posOffset>2521849</wp:posOffset>
                 </wp:positionH>
                 <wp:positionV relativeFrom="paragraph">
-                  <wp:posOffset>542925</wp:posOffset>
+                  <wp:posOffset>690245</wp:posOffset>
                 </wp:positionV>
                 <wp:extent cx="571500" cy="514350"/>
                 <wp:effectExtent l="19050" t="19050" r="38100" b="38100"/>
@@ -2460,7 +2951,7 @@
           </mc:Choice>
           <mc:Fallback>
             <w:pict>
-              <v:roundrect w14:anchorId="296CF797" id="Rectangle: Rounded Corners 31" o:spid="_x0000_s1026" style="position:absolute;margin-left:129.4pt;margin-top:42.75pt;width:45pt;height:40.5pt;z-index:251681792;visibility:visible;mso-wrap-style:square;mso-width-percent:0;mso-height-percent:0;mso-wrap-distance-left:9pt;mso-wrap-distance-top:0;mso-wrap-distance-right:9pt;mso-wrap-distance-bottom:0;mso-position-horizontal:absolute;mso-position-horizontal-relative:text;mso-position-vertical:absolute;mso-position-vertical-relative:text;mso-width-percent:0;mso-height-percent:0;mso-width-relative:margin;mso-height-relative:margin;v-text-anchor:middle" arcsize="10923f" o:gfxdata="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" filled="f" strokecolor="red" strokeweight="4.5pt">
+              <v:roundrect w14:anchorId="604CC438" id="Rectangle: Rounded Corners 31" o:spid="_x0000_s1026" style="position:absolute;margin-left:198.55pt;margin-top:54.35pt;width:45pt;height:40.5pt;z-index:251681792;visibility:visible;mso-wrap-style:square;mso-width-percent:0;mso-height-percent:0;mso-wrap-distance-left:9pt;mso-wrap-distance-top:0;mso-wrap-distance-right:9pt;mso-wrap-distance-bottom:0;mso-position-horizontal:absolute;mso-position-horizontal-relative:text;mso-position-vertical:absolute;mso-position-vertical-relative:text;mso-width-percent:0;mso-height-percent:0;mso-width-relative:margin;mso-height-relative:margin;v-text-anchor:middle" arcsize="10923f" o:gfxdata="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" filled="f" strokecolor="red" strokeweight="4.5pt">
                 <v:stroke joinstyle="miter"/>
               </v:roundrect>
             </w:pict>
@@ -2472,9 +2963,9 @@
           <w:noProof/>
         </w:rPr>
         <w:drawing>
-          <wp:inline distT="0" distB="0" distL="0" distR="0" wp14:anchorId="10FBC13F" wp14:editId="6F4BEB72">
-            <wp:extent cx="1827530" cy="1238250"/>
-            <wp:effectExtent l="0" t="0" r="1270" b="0"/>
+          <wp:inline distT="0" distB="0" distL="0" distR="0" wp14:anchorId="10FBC13F" wp14:editId="4D20C268">
+            <wp:extent cx="2160000" cy="1463516"/>
+            <wp:effectExtent l="0" t="0" r="0" b="3810"/>
             <wp:docPr id="15" name="Picture 15"/>
             <wp:cNvGraphicFramePr>
               <a:graphicFrameLocks xmlns:a="http://schemas.openxmlformats.org/drawingml/2006/main" noChangeAspect="1"/>
@@ -2502,7 +2993,7 @@
                   <pic:spPr bwMode="auto">
                     <a:xfrm>
                       <a:off x="0" y="0"/>
-                      <a:ext cx="1827752" cy="1238400"/>
+                      <a:ext cx="2160000" cy="1463516"/>
                     </a:xfrm>
                     <a:prstGeom prst="rect">
                       <a:avLst/>
@@ -2563,6 +3054,60 @@
       <w:r>
         <w:rPr>
           <w:rFonts w:ascii="Arial" w:hAnsi="Arial" w:cs="Arial"/>
+          <w:b/>
+          <w:bCs/>
+          <w:sz w:val="24"/>
+          <w:szCs w:val="24"/>
+        </w:rPr>
+        <w:t xml:space="preserve"> </w:t>
+      </w:r>
+      <w:r>
+        <w:rPr>
+          <w:rFonts w:ascii="Arial" w:hAnsi="Arial" w:cs="Arial"/>
+          <w:b/>
+          <w:bCs/>
+          <w:sz w:val="24"/>
+          <w:szCs w:val="24"/>
+        </w:rPr>
+        <w:drawing>
+          <wp:inline distT="0" distB="0" distL="0" distR="0" wp14:anchorId="003EAD7F" wp14:editId="7F92870C">
+            <wp:extent cx="552527" cy="562053"/>
+            <wp:effectExtent l="0" t="0" r="0" b="9525"/>
+            <wp:docPr id="8" name="Picture 8"/>
+            <wp:cNvGraphicFramePr>
+              <a:graphicFrameLocks xmlns:a="http://schemas.openxmlformats.org/drawingml/2006/main" noChangeAspect="1"/>
+            </wp:cNvGraphicFramePr>
+            <a:graphic xmlns:a="http://schemas.openxmlformats.org/drawingml/2006/main">
+              <a:graphicData uri="http://schemas.openxmlformats.org/drawingml/2006/picture">
+                <pic:pic xmlns:pic="http://schemas.openxmlformats.org/drawingml/2006/picture">
+                  <pic:nvPicPr>
+                    <pic:cNvPr id="1" name=""/>
+                    <pic:cNvPicPr/>
+                  </pic:nvPicPr>
+                  <pic:blipFill>
+                    <a:blip r:embed="rId23"/>
+                    <a:stretch>
+                      <a:fillRect/>
+                    </a:stretch>
+                  </pic:blipFill>
+                  <pic:spPr>
+                    <a:xfrm>
+                      <a:off x="0" y="0"/>
+                      <a:ext cx="552527" cy="562053"/>
+                    </a:xfrm>
+                    <a:prstGeom prst="rect">
+                      <a:avLst/>
+                    </a:prstGeom>
+                  </pic:spPr>
+                </pic:pic>
+              </a:graphicData>
+            </a:graphic>
+          </wp:inline>
+        </w:drawing>
+      </w:r>
+      <w:r>
+        <w:rPr>
+          <w:rFonts w:ascii="Arial" w:hAnsi="Arial" w:cs="Arial"/>
           <w:sz w:val="24"/>
           <w:szCs w:val="24"/>
           <w:lang w:val="en-PK"/>
@@ -2573,6 +3118,9 @@
     <w:p>
       <w:pPr>
         <w:jc w:val="center"/>
+        <w:rPr>
+          <w:lang w:val="en-PK"/>
+        </w:rPr>
       </w:pPr>
     </w:p>
     <w:p>
@@ -2584,9 +3132,9 @@
           <w:noProof/>
         </w:rPr>
         <w:drawing>
-          <wp:inline distT="0" distB="0" distL="0" distR="0" wp14:anchorId="798D6689" wp14:editId="6E710AE5">
-            <wp:extent cx="1827530" cy="1228725"/>
-            <wp:effectExtent l="0" t="0" r="1270" b="9525"/>
+          <wp:inline distT="0" distB="0" distL="0" distR="0" wp14:anchorId="798D6689" wp14:editId="2E60FF80">
+            <wp:extent cx="2160000" cy="1452259"/>
+            <wp:effectExtent l="0" t="0" r="0" b="0"/>
             <wp:docPr id="32" name="Picture 32"/>
             <wp:cNvGraphicFramePr>
               <a:graphicFrameLocks xmlns:a="http://schemas.openxmlformats.org/drawingml/2006/main" noChangeAspect="1"/>
@@ -2601,7 +3149,7 @@
                     </pic:cNvPicPr>
                   </pic:nvPicPr>
                   <pic:blipFill rotWithShape="1">
-                    <a:blip r:embed="rId23" cstate="print">
+                    <a:blip r:embed="rId24" cstate="print">
                       <a:extLst>
                         <a:ext uri="{28A0092B-C50C-407E-A947-70E740481C1C}">
                           <a14:useLocalDpi xmlns:a14="http://schemas.microsoft.com/office/drawing/2010/main" val="0"/>
@@ -2614,7 +3162,7 @@
                   <pic:spPr bwMode="auto">
                     <a:xfrm>
                       <a:off x="0" y="0"/>
-                      <a:ext cx="1827692" cy="1228834"/>
+                      <a:ext cx="2160000" cy="1452259"/>
                     </a:xfrm>
                     <a:prstGeom prst="rect">
                       <a:avLst/>
@@ -2653,7 +3201,7 @@
         </w:rPr>
         <w:sectPr>
           <w:type w:val="continuous"/>
-          <w:pgSz w:w="11906" w:h="16838" w:code="9"/>
+          <w:pgSz w:w="16838" w:h="11906" w:orient="landscape" w:code="9"/>
           <w:pgMar w:top="720" w:right="720" w:bottom="720" w:left="2160" w:header="432" w:footer="432" w:gutter="0"/>
           <w:cols w:num="2" w:sep="1" w:space="709"/>
           <w:docGrid w:linePitch="360"/>
@@ -2707,12 +3255,75 @@
     </w:p>
     <w:p>
       <w:pPr>
-        <w:pStyle w:val="IntenseHeading"/>
-      </w:pPr>
-      <w:r>
+        <w:pStyle w:val="Heading1"/>
+      </w:pPr>
+      <w:bookmarkStart w:id="3" w:name="_Toc239617979"/>
+      <w:r>
+        <w:rPr>
+          <w:noProof/>
+        </w:rPr>
         <w:lastRenderedPageBreak/>
+        <w:drawing>
+          <wp:anchor distT="0" distB="0" distL="114300" distR="114300" simplePos="0" relativeHeight="251658239" behindDoc="1" locked="0" layoutInCell="1" allowOverlap="1" wp14:anchorId="4AB953D7" wp14:editId="5DC15020">
+            <wp:simplePos x="0" y="0"/>
+            <wp:positionH relativeFrom="column">
+              <wp:posOffset>362849</wp:posOffset>
+            </wp:positionH>
+            <wp:positionV relativeFrom="paragraph">
+              <wp:posOffset>871220</wp:posOffset>
+            </wp:positionV>
+            <wp:extent cx="2491740" cy="5399405"/>
+            <wp:effectExtent l="0" t="0" r="3810" b="0"/>
+            <wp:wrapSquare wrapText="bothSides"/>
+            <wp:docPr id="11" name="Picture 11"/>
+            <wp:cNvGraphicFramePr>
+              <a:graphicFrameLocks xmlns:a="http://schemas.openxmlformats.org/drawingml/2006/main" noChangeAspect="1"/>
+            </wp:cNvGraphicFramePr>
+            <a:graphic xmlns:a="http://schemas.openxmlformats.org/drawingml/2006/main">
+              <a:graphicData uri="http://schemas.openxmlformats.org/drawingml/2006/picture">
+                <pic:pic xmlns:pic="http://schemas.openxmlformats.org/drawingml/2006/picture">
+                  <pic:nvPicPr>
+                    <pic:cNvPr id="0" name="Picture 1"/>
+                    <pic:cNvPicPr>
+                      <a:picLocks noChangeAspect="1" noChangeArrowheads="1"/>
+                    </pic:cNvPicPr>
+                  </pic:nvPicPr>
+                  <pic:blipFill>
+                    <a:blip r:embed="rId25" cstate="print">
+                      <a:extLst>
+                        <a:ext uri="{28A0092B-C50C-407E-A947-70E740481C1C}">
+                          <a14:useLocalDpi xmlns:a14="http://schemas.microsoft.com/office/drawing/2010/main" val="0"/>
+                        </a:ext>
+                      </a:extLst>
+                    </a:blip>
+                    <a:srcRect/>
+                    <a:stretch>
+                      <a:fillRect/>
+                    </a:stretch>
+                  </pic:blipFill>
+                  <pic:spPr bwMode="auto">
+                    <a:xfrm>
+                      <a:off x="0" y="0"/>
+                      <a:ext cx="2491740" cy="5399405"/>
+                    </a:xfrm>
+                    <a:prstGeom prst="rect">
+                      <a:avLst/>
+                    </a:prstGeom>
+                    <a:noFill/>
+                    <a:ln>
+                      <a:noFill/>
+                    </a:ln>
+                  </pic:spPr>
+                </pic:pic>
+              </a:graphicData>
+            </a:graphic>
+          </wp:anchor>
+        </w:drawing>
+      </w:r>
+      <w:r>
         <w:t>NORMAL APP USAGE</w:t>
       </w:r>
+      <w:bookmarkEnd w:id="3"/>
     </w:p>
     <w:p>
       <w:pPr>
@@ -2725,13 +3336,111 @@
         <mc:AlternateContent>
           <mc:Choice Requires="wps">
             <w:drawing>
-              <wp:anchor distT="0" distB="0" distL="114300" distR="114300" simplePos="0" relativeHeight="251675648" behindDoc="0" locked="0" layoutInCell="1" allowOverlap="1" wp14:anchorId="69EE5F1E" wp14:editId="513E4C58">
+              <wp:anchor distT="0" distB="0" distL="114300" distR="114300" simplePos="0" relativeHeight="251673600" behindDoc="0" locked="0" layoutInCell="1" allowOverlap="1" wp14:anchorId="26784210" wp14:editId="3675AF0D">
                 <wp:simplePos x="0" y="0"/>
                 <wp:positionH relativeFrom="column">
-                  <wp:posOffset>3343275</wp:posOffset>
+                  <wp:posOffset>2469779</wp:posOffset>
                 </wp:positionH>
                 <wp:positionV relativeFrom="paragraph">
-                  <wp:posOffset>763905</wp:posOffset>
+                  <wp:posOffset>250190</wp:posOffset>
+                </wp:positionV>
+                <wp:extent cx="342900" cy="342900"/>
+                <wp:effectExtent l="19050" t="19050" r="38100" b="38100"/>
+                <wp:wrapNone/>
+                <wp:docPr id="27" name="Rectangle: Rounded Corners 27"/>
+                <wp:cNvGraphicFramePr/>
+                <a:graphic xmlns:a="http://schemas.openxmlformats.org/drawingml/2006/main">
+                  <a:graphicData uri="http://schemas.microsoft.com/office/word/2010/wordprocessingShape">
+                    <wps:wsp>
+                      <wps:cNvSpPr/>
+                      <wps:spPr>
+                        <a:xfrm>
+                          <a:off x="0" y="0"/>
+                          <a:ext cx="342900" cy="342900"/>
+                        </a:xfrm>
+                        <a:prstGeom prst="roundRect">
+                          <a:avLst/>
+                        </a:prstGeom>
+                        <a:noFill/>
+                        <a:ln w="57150">
+                          <a:solidFill>
+                            <a:srgbClr val="FF0000"/>
+                          </a:solidFill>
+                        </a:ln>
+                      </wps:spPr>
+                      <wps:style>
+                        <a:lnRef idx="2">
+                          <a:schemeClr val="accent1">
+                            <a:shade val="50000"/>
+                          </a:schemeClr>
+                        </a:lnRef>
+                        <a:fillRef idx="1">
+                          <a:schemeClr val="accent1"/>
+                        </a:fillRef>
+                        <a:effectRef idx="0">
+                          <a:schemeClr val="accent1"/>
+                        </a:effectRef>
+                        <a:fontRef idx="minor">
+                          <a:schemeClr val="lt1"/>
+                        </a:fontRef>
+                      </wps:style>
+                      <wps:bodyPr rot="0" spcFirstLastPara="0" vertOverflow="overflow" horzOverflow="overflow" vert="horz" wrap="square" lIns="91440" tIns="45720" rIns="91440" bIns="45720" numCol="1" spcCol="0" rtlCol="0" fromWordArt="0" anchor="ctr" anchorCtr="0" forceAA="0" compatLnSpc="1">
+                        <a:prstTxWarp prst="textNoShape">
+                          <a:avLst/>
+                        </a:prstTxWarp>
+                        <a:noAutofit/>
+                      </wps:bodyPr>
+                    </wps:wsp>
+                  </a:graphicData>
+                </a:graphic>
+                <wp14:sizeRelH relativeFrom="margin">
+                  <wp14:pctWidth>0</wp14:pctWidth>
+                </wp14:sizeRelH>
+                <wp14:sizeRelV relativeFrom="margin">
+                  <wp14:pctHeight>0</wp14:pctHeight>
+                </wp14:sizeRelV>
+              </wp:anchor>
+            </w:drawing>
+          </mc:Choice>
+          <mc:Fallback>
+            <w:pict>
+              <v:roundrect w14:anchorId="13C440BC" id="Rectangle: Rounded Corners 27" o:spid="_x0000_s1026" style="position:absolute;margin-left:194.45pt;margin-top:19.7pt;width:27pt;height:27pt;z-index:251673600;visibility:visible;mso-wrap-style:square;mso-width-percent:0;mso-height-percent:0;mso-wrap-distance-left:9pt;mso-wrap-distance-top:0;mso-wrap-distance-right:9pt;mso-wrap-distance-bottom:0;mso-position-horizontal:absolute;mso-position-horizontal-relative:text;mso-position-vertical:absolute;mso-position-vertical-relative:text;mso-width-percent:0;mso-height-percent:0;mso-width-relative:margin;mso-height-relative:margin;v-text-anchor:middle" arcsize="10923f" o:gfxdata="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" filled="f" strokecolor="red" strokeweight="4.5pt">
+                <v:stroke joinstyle="miter"/>
+              </v:roundrect>
+            </w:pict>
+          </mc:Fallback>
+        </mc:AlternateContent>
+      </w:r>
+    </w:p>
+    <w:p>
+      <w:pPr>
+        <w:pStyle w:val="ListParagraph"/>
+        <w:numPr>
+          <w:ilvl w:val="0"/>
+          <w:numId w:val="3"/>
+        </w:numPr>
+        <w:jc w:val="both"/>
+        <w:rPr>
+          <w:rFonts w:ascii="Arial" w:hAnsi="Arial" w:cs="Arial"/>
+          <w:sz w:val="24"/>
+          <w:szCs w:val="24"/>
+          <w:lang w:val="en-PK"/>
+        </w:rPr>
+      </w:pPr>
+      <w:r>
+        <w:rPr>
+          <w:noProof/>
+        </w:rPr>
+        <mc:AlternateContent>
+          <mc:Choice Requires="wps">
+            <w:drawing>
+              <wp:anchor distT="0" distB="0" distL="114300" distR="114300" simplePos="0" relativeHeight="251675648" behindDoc="0" locked="0" layoutInCell="1" allowOverlap="1" wp14:anchorId="69EE5F1E" wp14:editId="17D621FC">
+                <wp:simplePos x="0" y="0"/>
+                <wp:positionH relativeFrom="column">
+                  <wp:posOffset>2115341</wp:posOffset>
+                </wp:positionH>
+                <wp:positionV relativeFrom="paragraph">
+                  <wp:posOffset>469265</wp:posOffset>
                 </wp:positionV>
                 <wp:extent cx="666750" cy="676275"/>
                 <wp:effectExtent l="19050" t="19050" r="38100" b="47625"/>
@@ -2793,7 +3502,7 @@
           </mc:Choice>
           <mc:Fallback>
             <w:pict>
-              <v:roundrect w14:anchorId="1B8DC157" id="Rectangle: Rounded Corners 28" o:spid="_x0000_s1026" style="position:absolute;margin-left:263.25pt;margin-top:60.15pt;width:52.5pt;height:53.25pt;z-index:251675648;visibility:visible;mso-wrap-style:square;mso-width-percent:0;mso-height-percent:0;mso-wrap-distance-left:9pt;mso-wrap-distance-top:0;mso-wrap-distance-right:9pt;mso-wrap-distance-bottom:0;mso-position-horizontal:absolute;mso-position-horizontal-relative:text;mso-position-vertical:absolute;mso-position-vertical-relative:text;mso-width-percent:0;mso-height-percent:0;mso-width-relative:margin;mso-height-relative:margin;v-text-anchor:middle" arcsize="10923f" o:gfxdata="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" filled="f" strokecolor="red" strokeweight="4.5pt">
+              <v:roundrect w14:anchorId="73690B07" id="Rectangle: Rounded Corners 28" o:spid="_x0000_s1026" style="position:absolute;margin-left:166.55pt;margin-top:36.95pt;width:52.5pt;height:53.25pt;z-index:251675648;visibility:visible;mso-wrap-style:square;mso-width-percent:0;mso-height-percent:0;mso-wrap-distance-left:9pt;mso-wrap-distance-top:0;mso-wrap-distance-right:9pt;mso-wrap-distance-bottom:0;mso-position-horizontal:absolute;mso-position-horizontal-relative:text;mso-position-vertical:absolute;mso-position-vertical-relative:text;mso-width-percent:0;mso-height-percent:0;mso-width-relative:margin;mso-height-relative:margin;v-text-anchor:middle" arcsize="10923f" o:gfxdata="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" filled="f" strokecolor="red" strokeweight="4.5pt">
                 <v:stroke joinstyle="miter"/>
               </v:roundrect>
             </w:pict>
@@ -2802,23 +3511,499 @@
       </w:r>
       <w:r>
         <w:rPr>
+          <w:rFonts w:ascii="Arial" w:hAnsi="Arial" w:cs="Arial"/>
+          <w:sz w:val="24"/>
+          <w:szCs w:val="24"/>
+          <w:lang w:val="en-PK"/>
+        </w:rPr>
+        <w:t xml:space="preserve">Tapping on </w:t>
+      </w:r>
+      <w:r>
+        <w:rPr>
+          <w:rFonts w:ascii="Arial" w:hAnsi="Arial" w:cs="Arial"/>
+          <w:noProof/>
+          <w:sz w:val="24"/>
+          <w:szCs w:val="24"/>
+          <w:lang w:val="en-PK"/>
+        </w:rPr>
+        <w:drawing>
+          <wp:inline distT="0" distB="0" distL="0" distR="0" wp14:anchorId="6F6E0AD1" wp14:editId="6BA1EE82">
+            <wp:extent cx="647790" cy="647790"/>
+            <wp:effectExtent l="0" t="0" r="0" b="0"/>
+            <wp:docPr id="18" name="Picture 18"/>
+            <wp:cNvGraphicFramePr>
+              <a:graphicFrameLocks xmlns:a="http://schemas.openxmlformats.org/drawingml/2006/main" noChangeAspect="1"/>
+            </wp:cNvGraphicFramePr>
+            <a:graphic xmlns:a="http://schemas.openxmlformats.org/drawingml/2006/main">
+              <a:graphicData uri="http://schemas.openxmlformats.org/drawingml/2006/picture">
+                <pic:pic xmlns:pic="http://schemas.openxmlformats.org/drawingml/2006/picture">
+                  <pic:nvPicPr>
+                    <pic:cNvPr id="1" name=""/>
+                    <pic:cNvPicPr/>
+                  </pic:nvPicPr>
+                  <pic:blipFill>
+                    <a:blip r:embed="rId26"/>
+                    <a:stretch>
+                      <a:fillRect/>
+                    </a:stretch>
+                  </pic:blipFill>
+                  <pic:spPr>
+                    <a:xfrm>
+                      <a:off x="0" y="0"/>
+                      <a:ext cx="647790" cy="647790"/>
+                    </a:xfrm>
+                    <a:prstGeom prst="rect">
+                      <a:avLst/>
+                    </a:prstGeom>
+                  </pic:spPr>
+                </pic:pic>
+              </a:graphicData>
+            </a:graphic>
+          </wp:inline>
+        </w:drawing>
+      </w:r>
+      <w:r>
+        <w:rPr>
+          <w:rFonts w:ascii="Arial" w:hAnsi="Arial" w:cs="Arial"/>
+          <w:sz w:val="24"/>
+          <w:szCs w:val="24"/>
+          <w:lang w:val="en-PK"/>
+        </w:rPr>
+        <w:t>button will initiate a manual sync for complete contacts directory</w:t>
+      </w:r>
+      <w:r>
+        <w:rPr>
+          <w:rFonts w:ascii="Arial" w:hAnsi="Arial" w:cs="Arial"/>
+          <w:sz w:val="24"/>
+          <w:szCs w:val="24"/>
+          <w:lang w:val="en-PK"/>
+        </w:rPr>
+        <w:t>. Manual update should only be initiated in case of non-updated state of a specific contact. Frequent pressing of the sync button will significantly affect phone’s battery time and life.</w:t>
+      </w:r>
+    </w:p>
+    <w:p>
+      <w:pPr>
+        <w:pStyle w:val="ListParagraph"/>
+        <w:jc w:val="both"/>
+        <w:rPr>
+          <w:rFonts w:ascii="Arial" w:hAnsi="Arial" w:cs="Arial"/>
+          <w:sz w:val="24"/>
+          <w:szCs w:val="24"/>
+          <w:lang w:val="en-PK"/>
+        </w:rPr>
+      </w:pPr>
+    </w:p>
+    <w:p>
+      <w:pPr>
+        <w:pStyle w:val="ListParagraph"/>
+        <w:numPr>
+          <w:ilvl w:val="0"/>
+          <w:numId w:val="3"/>
+        </w:numPr>
+        <w:jc w:val="both"/>
+        <w:rPr>
+          <w:rFonts w:ascii="Arial" w:hAnsi="Arial" w:cs="Arial"/>
+          <w:sz w:val="24"/>
+          <w:szCs w:val="24"/>
+          <w:lang w:val="en-PK"/>
+        </w:rPr>
+      </w:pPr>
+      <w:r>
+        <w:rPr>
+          <w:rFonts w:ascii="Arial" w:hAnsi="Arial" w:cs="Arial"/>
+          <w:sz w:val="24"/>
+          <w:szCs w:val="24"/>
+          <w:lang w:val="en-PK"/>
+        </w:rPr>
+        <w:t xml:space="preserve">App information page can be accessed by </w:t>
+      </w:r>
+      <w:r>
+        <w:rPr>
+          <w:rFonts w:ascii="Arial" w:hAnsi="Arial" w:cs="Arial"/>
+          <w:sz w:val="24"/>
+          <w:szCs w:val="24"/>
+          <w:lang w:val="en-PK"/>
+        </w:rPr>
+        <w:t>tapping on</w:t>
+      </w:r>
+      <w:r>
+        <w:rPr>
+          <w:rFonts w:ascii="Arial" w:hAnsi="Arial" w:cs="Arial"/>
+          <w:sz w:val="24"/>
+          <w:szCs w:val="24"/>
+          <w:lang w:val="en-PK"/>
+        </w:rPr>
+        <w:t xml:space="preserve"> </w:t>
+      </w:r>
+      <w:r>
+        <w:rPr>
+          <w:rFonts w:ascii="Arial" w:hAnsi="Arial" w:cs="Arial"/>
+          <w:noProof/>
+          <w:sz w:val="24"/>
+          <w:szCs w:val="24"/>
+          <w:lang w:val="en-PK"/>
+        </w:rPr>
+        <w:drawing>
+          <wp:inline distT="0" distB="0" distL="0" distR="0" wp14:anchorId="1E6DC048" wp14:editId="6D4C886D">
+            <wp:extent cx="342900" cy="361950"/>
+            <wp:effectExtent l="0" t="0" r="0" b="0"/>
+            <wp:docPr id="19" name="Picture 19"/>
+            <wp:cNvGraphicFramePr>
+              <a:graphicFrameLocks xmlns:a="http://schemas.openxmlformats.org/drawingml/2006/main" noChangeAspect="1"/>
+            </wp:cNvGraphicFramePr>
+            <a:graphic xmlns:a="http://schemas.openxmlformats.org/drawingml/2006/main">
+              <a:graphicData uri="http://schemas.openxmlformats.org/drawingml/2006/picture">
+                <pic:pic xmlns:pic="http://schemas.openxmlformats.org/drawingml/2006/picture">
+                  <pic:nvPicPr>
+                    <pic:cNvPr id="1" name=""/>
+                    <pic:cNvPicPr/>
+                  </pic:nvPicPr>
+                  <pic:blipFill rotWithShape="1">
+                    <a:blip r:embed="rId27"/>
+                    <a:srcRect l="25000" t="-2702" b="-1"/>
+                    <a:stretch/>
+                  </pic:blipFill>
+                  <pic:spPr bwMode="auto">
+                    <a:xfrm>
+                      <a:off x="0" y="0"/>
+                      <a:ext cx="342948" cy="362001"/>
+                    </a:xfrm>
+                    <a:prstGeom prst="rect">
+                      <a:avLst/>
+                    </a:prstGeom>
+                    <a:ln>
+                      <a:noFill/>
+                    </a:ln>
+                    <a:extLst>
+                      <a:ext uri="{53640926-AAD7-44D8-BBD7-CCE9431645EC}">
+                        <a14:shadowObscured xmlns:a14="http://schemas.microsoft.com/office/drawing/2010/main"/>
+                      </a:ext>
+                    </a:extLst>
+                  </pic:spPr>
+                </pic:pic>
+              </a:graphicData>
+            </a:graphic>
+          </wp:inline>
+        </w:drawing>
+      </w:r>
+      <w:r>
+        <w:rPr>
+          <w:rFonts w:ascii="Arial" w:hAnsi="Arial" w:cs="Arial"/>
+          <w:sz w:val="24"/>
+          <w:szCs w:val="24"/>
+          <w:lang w:val="en-PK"/>
+        </w:rPr>
+        <w:t xml:space="preserve"> button in the top right corner of the main page.</w:t>
+      </w:r>
+    </w:p>
+    <w:p>
+      <w:pPr>
+        <w:pStyle w:val="ListParagraph"/>
+        <w:rPr>
+          <w:rFonts w:ascii="Arial" w:hAnsi="Arial" w:cs="Arial"/>
+          <w:sz w:val="24"/>
+          <w:szCs w:val="24"/>
+          <w:lang w:val="en-PK"/>
+        </w:rPr>
+      </w:pPr>
+    </w:p>
+    <w:p>
+      <w:pPr>
+        <w:pStyle w:val="ListParagraph"/>
+        <w:numPr>
+          <w:ilvl w:val="0"/>
+          <w:numId w:val="3"/>
+        </w:numPr>
+        <w:jc w:val="both"/>
+        <w:rPr>
+          <w:rFonts w:ascii="Arial" w:hAnsi="Arial" w:cs="Arial"/>
+          <w:sz w:val="24"/>
+          <w:szCs w:val="24"/>
+          <w:lang w:val="en-PK"/>
+        </w:rPr>
+      </w:pPr>
+      <w:r>
+        <w:rPr>
+          <w:rFonts w:ascii="Arial" w:hAnsi="Arial" w:cs="Arial"/>
+          <w:sz w:val="24"/>
+          <w:szCs w:val="24"/>
+          <w:lang w:val="en-PK"/>
+        </w:rPr>
+        <w:t xml:space="preserve">In case of any assistance, LTE Section, </w:t>
+      </w:r>
+      <w:proofErr w:type="gramStart"/>
+      <w:r>
+        <w:rPr>
+          <w:rFonts w:ascii="Arial" w:hAnsi="Arial" w:cs="Arial"/>
+          <w:sz w:val="24"/>
+          <w:szCs w:val="24"/>
+          <w:lang w:val="en-PK"/>
+        </w:rPr>
+        <w:t>No</w:t>
+      </w:r>
+      <w:proofErr w:type="gramEnd"/>
+      <w:r>
+        <w:rPr>
+          <w:rFonts w:ascii="Arial" w:hAnsi="Arial" w:cs="Arial"/>
+          <w:sz w:val="24"/>
+          <w:szCs w:val="24"/>
+          <w:lang w:val="en-PK"/>
+        </w:rPr>
+        <w:t xml:space="preserve"> 1 Comm Wing may approached.</w:t>
+      </w:r>
+    </w:p>
+    <w:p>
+      <w:pPr>
+        <w:rPr>
+          <w:rFonts w:ascii="Arial" w:hAnsi="Arial" w:cs="Arial"/>
+          <w:sz w:val="24"/>
+          <w:szCs w:val="24"/>
+          <w:lang w:val="en-PK"/>
+        </w:rPr>
+      </w:pPr>
+      <w:r>
+        <w:rPr>
+          <w:rFonts w:ascii="Arial" w:hAnsi="Arial" w:cs="Arial"/>
+          <w:sz w:val="24"/>
+          <w:szCs w:val="24"/>
+          <w:lang w:val="en-PK"/>
+        </w:rPr>
+        <w:br w:type="page"/>
+      </w:r>
+    </w:p>
+    <w:p>
+      <w:pPr>
+        <w:pStyle w:val="ListParagraph"/>
+        <w:jc w:val="both"/>
+        <w:rPr>
+          <w:rFonts w:ascii="Arial" w:hAnsi="Arial" w:cs="Arial"/>
+          <w:sz w:val="24"/>
+          <w:szCs w:val="24"/>
+          <w:lang w:val="en-PK"/>
+        </w:rPr>
+      </w:pPr>
+      <w:r>
+        <w:rPr>
+          <w:noProof/>
+        </w:rPr>
+        <w:lastRenderedPageBreak/>
+        <w:drawing>
+          <wp:anchor distT="0" distB="0" distL="114300" distR="114300" simplePos="0" relativeHeight="251657214" behindDoc="0" locked="0" layoutInCell="1" allowOverlap="1" wp14:anchorId="70C10002" wp14:editId="78390BB5">
+            <wp:simplePos x="0" y="0"/>
+            <wp:positionH relativeFrom="column">
+              <wp:posOffset>317392</wp:posOffset>
+            </wp:positionH>
+            <wp:positionV relativeFrom="paragraph">
+              <wp:posOffset>0</wp:posOffset>
+            </wp:positionV>
+            <wp:extent cx="2492375" cy="5399405"/>
+            <wp:effectExtent l="0" t="0" r="3175" b="0"/>
+            <wp:wrapSquare wrapText="bothSides"/>
+            <wp:docPr id="17" name="Picture 17"/>
+            <wp:cNvGraphicFramePr>
+              <a:graphicFrameLocks xmlns:a="http://schemas.openxmlformats.org/drawingml/2006/main" noChangeAspect="1"/>
+            </wp:cNvGraphicFramePr>
+            <a:graphic xmlns:a="http://schemas.openxmlformats.org/drawingml/2006/main">
+              <a:graphicData uri="http://schemas.openxmlformats.org/drawingml/2006/picture">
+                <pic:pic xmlns:pic="http://schemas.openxmlformats.org/drawingml/2006/picture">
+                  <pic:nvPicPr>
+                    <pic:cNvPr id="0" name="Picture 28"/>
+                    <pic:cNvPicPr>
+                      <a:picLocks noChangeAspect="1" noChangeArrowheads="1"/>
+                    </pic:cNvPicPr>
+                  </pic:nvPicPr>
+                  <pic:blipFill>
+                    <a:blip r:embed="rId28" cstate="print">
+                      <a:extLst>
+                        <a:ext uri="{28A0092B-C50C-407E-A947-70E740481C1C}">
+                          <a14:useLocalDpi xmlns:a14="http://schemas.microsoft.com/office/drawing/2010/main" val="0"/>
+                        </a:ext>
+                      </a:extLst>
+                    </a:blip>
+                    <a:srcRect/>
+                    <a:stretch>
+                      <a:fillRect/>
+                    </a:stretch>
+                  </pic:blipFill>
+                  <pic:spPr bwMode="auto">
+                    <a:xfrm>
+                      <a:off x="0" y="0"/>
+                      <a:ext cx="2492375" cy="5399405"/>
+                    </a:xfrm>
+                    <a:prstGeom prst="rect">
+                      <a:avLst/>
+                    </a:prstGeom>
+                    <a:noFill/>
+                    <a:ln>
+                      <a:noFill/>
+                    </a:ln>
+                  </pic:spPr>
+                </pic:pic>
+              </a:graphicData>
+            </a:graphic>
+          </wp:anchor>
+        </w:drawing>
+      </w:r>
+    </w:p>
+    <w:p>
+      <w:pPr>
+        <w:jc w:val="center"/>
+      </w:pPr>
+    </w:p>
+    <w:p>
+      <w:pPr>
+        <w:pStyle w:val="ListParagraph"/>
+        <w:numPr>
+          <w:ilvl w:val="0"/>
+          <w:numId w:val="3"/>
+        </w:numPr>
+        <w:jc w:val="both"/>
+        <w:rPr>
+          <w:rFonts w:ascii="Arial" w:hAnsi="Arial" w:cs="Arial"/>
+          <w:sz w:val="24"/>
+          <w:szCs w:val="24"/>
+          <w:lang w:val="en-PK"/>
+        </w:rPr>
+      </w:pPr>
+      <w:proofErr w:type="spellStart"/>
+      <w:r>
+        <w:rPr>
+          <w:rFonts w:ascii="Arial" w:hAnsi="Arial" w:cs="Arial"/>
+          <w:sz w:val="24"/>
+          <w:szCs w:val="24"/>
+          <w:lang w:val="en-PK"/>
+        </w:rPr>
+        <w:t>AirContacts</w:t>
+      </w:r>
+      <w:proofErr w:type="spellEnd"/>
+      <w:r>
+        <w:rPr>
+          <w:rFonts w:ascii="Arial" w:hAnsi="Arial" w:cs="Arial"/>
+          <w:sz w:val="24"/>
+          <w:szCs w:val="24"/>
+          <w:lang w:val="en-PK"/>
+        </w:rPr>
+        <w:t xml:space="preserve"> App Information Page</w:t>
+      </w:r>
+    </w:p>
+    <w:p>
+      <w:pPr>
+        <w:pStyle w:val="ListParagraph"/>
+        <w:jc w:val="both"/>
+        <w:rPr>
+          <w:rFonts w:ascii="Arial" w:hAnsi="Arial" w:cs="Arial"/>
+          <w:sz w:val="24"/>
+          <w:szCs w:val="24"/>
+          <w:lang w:val="en-PK"/>
+        </w:rPr>
+      </w:pPr>
+    </w:p>
+    <w:p>
+      <w:pPr>
+        <w:pStyle w:val="ListParagraph"/>
+        <w:numPr>
+          <w:ilvl w:val="0"/>
+          <w:numId w:val="3"/>
+        </w:numPr>
+        <w:jc w:val="both"/>
+        <w:rPr>
+          <w:rFonts w:ascii="Arial" w:hAnsi="Arial" w:cs="Arial"/>
+          <w:sz w:val="24"/>
+          <w:szCs w:val="24"/>
+          <w:lang w:val="en-PK"/>
+        </w:rPr>
+      </w:pPr>
+      <w:r>
+        <w:rPr>
+          <w:rFonts w:ascii="Arial" w:hAnsi="Arial" w:cs="Arial"/>
+          <w:sz w:val="24"/>
+          <w:szCs w:val="24"/>
+          <w:lang w:val="en-PK"/>
+        </w:rPr>
+        <w:t xml:space="preserve">Tapping on </w:t>
+      </w:r>
+      <w:r>
+        <w:rPr>
+          <w:rFonts w:ascii="Arial" w:hAnsi="Arial" w:cs="Arial"/>
+          <w:noProof/>
+          <w:sz w:val="24"/>
+          <w:szCs w:val="24"/>
+          <w:lang w:val="en-PK"/>
+        </w:rPr>
+        <w:drawing>
+          <wp:inline distT="0" distB="0" distL="0" distR="0" wp14:anchorId="79E8075B" wp14:editId="556F21BF">
+            <wp:extent cx="2295845" cy="552527"/>
+            <wp:effectExtent l="0" t="0" r="9525" b="0"/>
+            <wp:docPr id="34" name="Picture 34"/>
+            <wp:cNvGraphicFramePr>
+              <a:graphicFrameLocks xmlns:a="http://schemas.openxmlformats.org/drawingml/2006/main" noChangeAspect="1"/>
+            </wp:cNvGraphicFramePr>
+            <a:graphic xmlns:a="http://schemas.openxmlformats.org/drawingml/2006/main">
+              <a:graphicData uri="http://schemas.openxmlformats.org/drawingml/2006/picture">
+                <pic:pic xmlns:pic="http://schemas.openxmlformats.org/drawingml/2006/picture">
+                  <pic:nvPicPr>
+                    <pic:cNvPr id="1" name=""/>
+                    <pic:cNvPicPr/>
+                  </pic:nvPicPr>
+                  <pic:blipFill>
+                    <a:blip r:embed="rId29"/>
+                    <a:stretch>
+                      <a:fillRect/>
+                    </a:stretch>
+                  </pic:blipFill>
+                  <pic:spPr>
+                    <a:xfrm>
+                      <a:off x="0" y="0"/>
+                      <a:ext cx="2295845" cy="552527"/>
+                    </a:xfrm>
+                    <a:prstGeom prst="rect">
+                      <a:avLst/>
+                    </a:prstGeom>
+                  </pic:spPr>
+                </pic:pic>
+              </a:graphicData>
+            </a:graphic>
+          </wp:inline>
+        </w:drawing>
+      </w:r>
+      <w:r>
+        <w:rPr>
+          <w:rFonts w:ascii="Arial" w:hAnsi="Arial" w:cs="Arial"/>
+          <w:sz w:val="24"/>
+          <w:szCs w:val="24"/>
+          <w:lang w:val="en-PK"/>
+        </w:rPr>
+        <w:t>will take the user to this User Guide.</w:t>
+      </w:r>
+    </w:p>
+    <w:p>
+      <w:pPr>
+        <w:jc w:val="center"/>
+        <w:rPr>
+          <w:rFonts w:ascii="Arial" w:hAnsi="Arial" w:cs="Arial"/>
+          <w:sz w:val="24"/>
+          <w:szCs w:val="24"/>
+        </w:rPr>
+      </w:pPr>
+      <w:r>
+        <w:rPr>
           <w:noProof/>
         </w:rPr>
         <mc:AlternateContent>
           <mc:Choice Requires="wps">
             <w:drawing>
-              <wp:anchor distT="0" distB="0" distL="114300" distR="114300" simplePos="0" relativeHeight="251673600" behindDoc="0" locked="0" layoutInCell="1" allowOverlap="1" wp14:anchorId="26784210" wp14:editId="4146E0C1">
+              <wp:anchor distT="0" distB="0" distL="114300" distR="114300" simplePos="0" relativeHeight="251683840" behindDoc="0" locked="0" layoutInCell="1" allowOverlap="1" wp14:anchorId="44579F72" wp14:editId="464CC613">
                 <wp:simplePos x="0" y="0"/>
                 <wp:positionH relativeFrom="column">
-                  <wp:posOffset>3733800</wp:posOffset>
+                  <wp:posOffset>439636</wp:posOffset>
                 </wp:positionH>
                 <wp:positionV relativeFrom="paragraph">
-                  <wp:posOffset>259080</wp:posOffset>
+                  <wp:posOffset>650240</wp:posOffset>
                 </wp:positionV>
-                <wp:extent cx="342900" cy="342900"/>
-                <wp:effectExtent l="19050" t="19050" r="38100" b="38100"/>
+                <wp:extent cx="2233953" cy="676275"/>
+                <wp:effectExtent l="19050" t="19050" r="33020" b="47625"/>
                 <wp:wrapNone/>
-                <wp:docPr id="27" name="Rectangle: Rounded Corners 27"/>
+                <wp:docPr id="33" name="Rectangle: Rounded Corners 33"/>
                 <wp:cNvGraphicFramePr/>
                 <a:graphic xmlns:a="http://schemas.openxmlformats.org/drawingml/2006/main">
                   <a:graphicData uri="http://schemas.microsoft.com/office/word/2010/wordprocessingShape">
@@ -2827,7 +4012,7 @@
                       <wps:spPr>
                         <a:xfrm>
                           <a:off x="0" y="0"/>
-                          <a:ext cx="342900" cy="342900"/>
+                          <a:ext cx="2233953" cy="676275"/>
                         </a:xfrm>
                         <a:prstGeom prst="roundRect">
                           <a:avLst/>
@@ -2875,7 +4060,7 @@
           </mc:Choice>
           <mc:Fallback>
             <w:pict>
-              <v:roundrect w14:anchorId="42A8EB75" id="Rectangle: Rounded Corners 27" o:spid="_x0000_s1026" style="position:absolute;margin-left:294pt;margin-top:20.4pt;width:27pt;height:27pt;z-index:251673600;visibility:visible;mso-wrap-style:square;mso-width-percent:0;mso-height-percent:0;mso-wrap-distance-left:9pt;mso-wrap-distance-top:0;mso-wrap-distance-right:9pt;mso-wrap-distance-bottom:0;mso-position-horizontal:absolute;mso-position-horizontal-relative:text;mso-position-vertical:absolute;mso-position-vertical-relative:text;mso-width-percent:0;mso-height-percent:0;mso-width-relative:margin;mso-height-relative:margin;v-text-anchor:middle" arcsize="10923f" o:gfxdata="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" filled="f" strokecolor="red" strokeweight="4.5pt">
+              <v:roundrect w14:anchorId="1562AB0E" id="Rectangle: Rounded Corners 33" o:spid="_x0000_s1026" style="position:absolute;margin-left:34.6pt;margin-top:51.2pt;width:175.9pt;height:53.25pt;z-index:251683840;visibility:visible;mso-wrap-style:square;mso-width-percent:0;mso-height-percent:0;mso-wrap-distance-left:9pt;mso-wrap-distance-top:0;mso-wrap-distance-right:9pt;mso-wrap-distance-bottom:0;mso-position-horizontal:absolute;mso-position-horizontal-relative:text;mso-position-vertical:absolute;mso-position-vertical-relative:text;mso-width-percent:0;mso-height-percent:0;mso-width-relative:margin;mso-height-relative:margin;v-text-anchor:middle" arcsize="10923f" o:gfxdata="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" filled="f" strokecolor="red" strokeweight="4.5pt">
                 <v:stroke joinstyle="miter"/>
               </v:roundrect>
             </w:pict>
@@ -2884,594 +4069,6 @@
       </w:r>
       <w:r>
         <w:rPr>
-          <w:noProof/>
-        </w:rPr>
-        <w:drawing>
-          <wp:inline distT="0" distB="0" distL="0" distR="0" wp14:anchorId="4AB953D7" wp14:editId="2E145BE2">
-            <wp:extent cx="2492038" cy="5400000"/>
-            <wp:effectExtent l="0" t="0" r="3810" b="0"/>
-            <wp:docPr id="11" name="Picture 11"/>
-            <wp:cNvGraphicFramePr>
-              <a:graphicFrameLocks xmlns:a="http://schemas.openxmlformats.org/drawingml/2006/main" noChangeAspect="1"/>
-            </wp:cNvGraphicFramePr>
-            <a:graphic xmlns:a="http://schemas.openxmlformats.org/drawingml/2006/main">
-              <a:graphicData uri="http://schemas.openxmlformats.org/drawingml/2006/picture">
-                <pic:pic xmlns:pic="http://schemas.openxmlformats.org/drawingml/2006/picture">
-                  <pic:nvPicPr>
-                    <pic:cNvPr id="0" name="Picture 1"/>
-                    <pic:cNvPicPr>
-                      <a:picLocks noChangeAspect="1" noChangeArrowheads="1"/>
-                    </pic:cNvPicPr>
-                  </pic:nvPicPr>
-                  <pic:blipFill>
-                    <a:blip r:embed="rId24" cstate="print">
-                      <a:extLst>
-                        <a:ext uri="{28A0092B-C50C-407E-A947-70E740481C1C}">
-                          <a14:useLocalDpi xmlns:a14="http://schemas.microsoft.com/office/drawing/2010/main" val="0"/>
-                        </a:ext>
-                      </a:extLst>
-                    </a:blip>
-                    <a:srcRect/>
-                    <a:stretch>
-                      <a:fillRect/>
-                    </a:stretch>
-                  </pic:blipFill>
-                  <pic:spPr bwMode="auto">
-                    <a:xfrm>
-                      <a:off x="0" y="0"/>
-                      <a:ext cx="2492038" cy="5400000"/>
-                    </a:xfrm>
-                    <a:prstGeom prst="rect">
-                      <a:avLst/>
-                    </a:prstGeom>
-                    <a:noFill/>
-                    <a:ln>
-                      <a:noFill/>
-                    </a:ln>
-                  </pic:spPr>
-                </pic:pic>
-              </a:graphicData>
-            </a:graphic>
-          </wp:inline>
-        </w:drawing>
-      </w:r>
-    </w:p>
-    <w:p>
-      <w:pPr>
-        <w:pStyle w:val="ListParagraph"/>
-        <w:numPr>
-          <w:ilvl w:val="0"/>
-          <w:numId w:val="3"/>
-        </w:numPr>
-        <w:jc w:val="both"/>
-        <w:rPr>
-          <w:rFonts w:ascii="Arial" w:hAnsi="Arial" w:cs="Arial"/>
-          <w:sz w:val="24"/>
-          <w:szCs w:val="24"/>
-          <w:lang w:val="en-PK"/>
-        </w:rPr>
-      </w:pPr>
-      <w:r>
-        <w:rPr>
-          <w:rFonts w:ascii="Arial" w:hAnsi="Arial" w:cs="Arial"/>
-          <w:sz w:val="24"/>
-          <w:szCs w:val="24"/>
-          <w:lang w:val="en-PK"/>
-        </w:rPr>
-        <w:t xml:space="preserve">Tapping on </w:t>
-      </w:r>
-      <w:r>
-        <w:rPr>
-          <w:rFonts w:ascii="Arial" w:hAnsi="Arial" w:cs="Arial"/>
-          <w:noProof/>
-          <w:sz w:val="24"/>
-          <w:szCs w:val="24"/>
-          <w:lang w:val="en-PK"/>
-        </w:rPr>
-        <w:drawing>
-          <wp:inline distT="0" distB="0" distL="0" distR="0" wp14:anchorId="6F6E0AD1" wp14:editId="6BA1EE82">
-            <wp:extent cx="647790" cy="647790"/>
-            <wp:effectExtent l="0" t="0" r="0" b="0"/>
-            <wp:docPr id="18" name="Picture 18"/>
-            <wp:cNvGraphicFramePr>
-              <a:graphicFrameLocks xmlns:a="http://schemas.openxmlformats.org/drawingml/2006/main" noChangeAspect="1"/>
-            </wp:cNvGraphicFramePr>
-            <a:graphic xmlns:a="http://schemas.openxmlformats.org/drawingml/2006/main">
-              <a:graphicData uri="http://schemas.openxmlformats.org/drawingml/2006/picture">
-                <pic:pic xmlns:pic="http://schemas.openxmlformats.org/drawingml/2006/picture">
-                  <pic:nvPicPr>
-                    <pic:cNvPr id="1" name=""/>
-                    <pic:cNvPicPr/>
-                  </pic:nvPicPr>
-                  <pic:blipFill>
-                    <a:blip r:embed="rId25"/>
-                    <a:stretch>
-                      <a:fillRect/>
-                    </a:stretch>
-                  </pic:blipFill>
-                  <pic:spPr>
-                    <a:xfrm>
-                      <a:off x="0" y="0"/>
-                      <a:ext cx="647790" cy="647790"/>
-                    </a:xfrm>
-                    <a:prstGeom prst="rect">
-                      <a:avLst/>
-                    </a:prstGeom>
-                  </pic:spPr>
-                </pic:pic>
-              </a:graphicData>
-            </a:graphic>
-          </wp:inline>
-        </w:drawing>
-      </w:r>
-      <w:r>
-        <w:rPr>
-          <w:rFonts w:ascii="Arial" w:hAnsi="Arial" w:cs="Arial"/>
-          <w:sz w:val="24"/>
-          <w:szCs w:val="24"/>
-          <w:lang w:val="en-PK"/>
-        </w:rPr>
-        <w:t>button will initiate a manual sync for complete contacts directory</w:t>
-      </w:r>
-      <w:r>
-        <w:rPr>
-          <w:rFonts w:ascii="Arial" w:hAnsi="Arial" w:cs="Arial"/>
-          <w:sz w:val="24"/>
-          <w:szCs w:val="24"/>
-          <w:lang w:val="en-PK"/>
-        </w:rPr>
-        <w:t>. Manual update should only be initiated in case of non-updated state of a specific contact. Frequent pressing of the sync button will significantly affect phone’s battery time and life.</w:t>
-      </w:r>
-    </w:p>
-    <w:p>
-      <w:pPr>
-        <w:pStyle w:val="ListParagraph"/>
-        <w:jc w:val="both"/>
-        <w:rPr>
-          <w:rFonts w:ascii="Arial" w:hAnsi="Arial" w:cs="Arial"/>
-          <w:sz w:val="24"/>
-          <w:szCs w:val="24"/>
-          <w:lang w:val="en-PK"/>
-        </w:rPr>
-      </w:pPr>
-    </w:p>
-    <w:p>
-      <w:pPr>
-        <w:pStyle w:val="ListParagraph"/>
-        <w:numPr>
-          <w:ilvl w:val="0"/>
-          <w:numId w:val="3"/>
-        </w:numPr>
-        <w:jc w:val="both"/>
-        <w:rPr>
-          <w:rFonts w:ascii="Arial" w:hAnsi="Arial" w:cs="Arial"/>
-          <w:sz w:val="24"/>
-          <w:szCs w:val="24"/>
-          <w:lang w:val="en-PK"/>
-        </w:rPr>
-      </w:pPr>
-      <w:r>
-        <w:rPr>
-          <w:rFonts w:ascii="Arial" w:hAnsi="Arial" w:cs="Arial"/>
-          <w:sz w:val="24"/>
-          <w:szCs w:val="24"/>
-          <w:lang w:val="en-PK"/>
-        </w:rPr>
-        <w:t xml:space="preserve">App information page can be accessed by </w:t>
-      </w:r>
-      <w:r>
-        <w:rPr>
-          <w:rFonts w:ascii="Arial" w:hAnsi="Arial" w:cs="Arial"/>
-          <w:sz w:val="24"/>
-          <w:szCs w:val="24"/>
-          <w:lang w:val="en-PK"/>
-        </w:rPr>
-        <w:t>tapping on</w:t>
-      </w:r>
-      <w:r>
-        <w:rPr>
-          <w:rFonts w:ascii="Arial" w:hAnsi="Arial" w:cs="Arial"/>
-          <w:sz w:val="24"/>
-          <w:szCs w:val="24"/>
-          <w:lang w:val="en-PK"/>
-        </w:rPr>
-        <w:t xml:space="preserve"> </w:t>
-      </w:r>
-      <w:r>
-        <w:rPr>
-          <w:rFonts w:ascii="Arial" w:hAnsi="Arial" w:cs="Arial"/>
-          <w:noProof/>
-          <w:sz w:val="24"/>
-          <w:szCs w:val="24"/>
-          <w:lang w:val="en-PK"/>
-        </w:rPr>
-        <w:drawing>
-          <wp:inline distT="0" distB="0" distL="0" distR="0" wp14:anchorId="1E6DC048" wp14:editId="6D4C886D">
-            <wp:extent cx="342900" cy="361950"/>
-            <wp:effectExtent l="0" t="0" r="0" b="0"/>
-            <wp:docPr id="19" name="Picture 19"/>
-            <wp:cNvGraphicFramePr>
-              <a:graphicFrameLocks xmlns:a="http://schemas.openxmlformats.org/drawingml/2006/main" noChangeAspect="1"/>
-            </wp:cNvGraphicFramePr>
-            <a:graphic xmlns:a="http://schemas.openxmlformats.org/drawingml/2006/main">
-              <a:graphicData uri="http://schemas.openxmlformats.org/drawingml/2006/picture">
-                <pic:pic xmlns:pic="http://schemas.openxmlformats.org/drawingml/2006/picture">
-                  <pic:nvPicPr>
-                    <pic:cNvPr id="1" name=""/>
-                    <pic:cNvPicPr/>
-                  </pic:nvPicPr>
-                  <pic:blipFill rotWithShape="1">
-                    <a:blip r:embed="rId26"/>
-                    <a:srcRect l="25000" t="-2702" b="-1"/>
-                    <a:stretch/>
-                  </pic:blipFill>
-                  <pic:spPr bwMode="auto">
-                    <a:xfrm>
-                      <a:off x="0" y="0"/>
-                      <a:ext cx="342948" cy="362001"/>
-                    </a:xfrm>
-                    <a:prstGeom prst="rect">
-                      <a:avLst/>
-                    </a:prstGeom>
-                    <a:ln>
-                      <a:noFill/>
-                    </a:ln>
-                    <a:extLst>
-                      <a:ext uri="{53640926-AAD7-44D8-BBD7-CCE9431645EC}">
-                        <a14:shadowObscured xmlns:a14="http://schemas.microsoft.com/office/drawing/2010/main"/>
-                      </a:ext>
-                    </a:extLst>
-                  </pic:spPr>
-                </pic:pic>
-              </a:graphicData>
-            </a:graphic>
-          </wp:inline>
-        </w:drawing>
-      </w:r>
-      <w:r>
-        <w:rPr>
-          <w:rFonts w:ascii="Arial" w:hAnsi="Arial" w:cs="Arial"/>
-          <w:sz w:val="24"/>
-          <w:szCs w:val="24"/>
-          <w:lang w:val="en-PK"/>
-        </w:rPr>
-        <w:t xml:space="preserve"> button in the top right corner of the main page.</w:t>
-      </w:r>
-    </w:p>
-    <w:p>
-      <w:pPr>
-        <w:pStyle w:val="ListParagraph"/>
-        <w:rPr>
-          <w:rFonts w:ascii="Arial" w:hAnsi="Arial" w:cs="Arial"/>
-          <w:sz w:val="24"/>
-          <w:szCs w:val="24"/>
-          <w:lang w:val="en-PK"/>
-        </w:rPr>
-      </w:pPr>
-    </w:p>
-    <w:p>
-      <w:pPr>
-        <w:pStyle w:val="ListParagraph"/>
-        <w:numPr>
-          <w:ilvl w:val="0"/>
-          <w:numId w:val="3"/>
-        </w:numPr>
-        <w:jc w:val="both"/>
-        <w:rPr>
-          <w:rFonts w:ascii="Arial" w:hAnsi="Arial" w:cs="Arial"/>
-          <w:sz w:val="24"/>
-          <w:szCs w:val="24"/>
-          <w:lang w:val="en-PK"/>
-        </w:rPr>
-      </w:pPr>
-      <w:r>
-        <w:rPr>
-          <w:rFonts w:ascii="Arial" w:hAnsi="Arial" w:cs="Arial"/>
-          <w:sz w:val="24"/>
-          <w:szCs w:val="24"/>
-          <w:lang w:val="en-PK"/>
-        </w:rPr>
-        <w:t xml:space="preserve">In case of any assistance, LTE Section, </w:t>
-      </w:r>
-      <w:proofErr w:type="gramStart"/>
-      <w:r>
-        <w:rPr>
-          <w:rFonts w:ascii="Arial" w:hAnsi="Arial" w:cs="Arial"/>
-          <w:sz w:val="24"/>
-          <w:szCs w:val="24"/>
-          <w:lang w:val="en-PK"/>
-        </w:rPr>
-        <w:t>No</w:t>
-      </w:r>
-      <w:proofErr w:type="gramEnd"/>
-      <w:r>
-        <w:rPr>
-          <w:rFonts w:ascii="Arial" w:hAnsi="Arial" w:cs="Arial"/>
-          <w:sz w:val="24"/>
-          <w:szCs w:val="24"/>
-          <w:lang w:val="en-PK"/>
-        </w:rPr>
-        <w:t xml:space="preserve"> 1 Comm Wing may approached.</w:t>
-      </w:r>
-    </w:p>
-    <w:p>
-      <w:pPr>
-        <w:jc w:val="center"/>
-      </w:pPr>
-      <w:r>
-        <w:rPr>
-          <w:noProof/>
-        </w:rPr>
-        <w:lastRenderedPageBreak/>
-        <mc:AlternateContent>
-          <mc:Choice Requires="wps">
-            <w:drawing>
-              <wp:anchor distT="0" distB="0" distL="114300" distR="114300" simplePos="0" relativeHeight="251683840" behindDoc="0" locked="0" layoutInCell="1" allowOverlap="1" wp14:anchorId="44579F72" wp14:editId="615178D3">
-                <wp:simplePos x="0" y="0"/>
-                <wp:positionH relativeFrom="column">
-                  <wp:posOffset>1523999</wp:posOffset>
-                </wp:positionH>
-                <wp:positionV relativeFrom="paragraph">
-                  <wp:posOffset>2286000</wp:posOffset>
-                </wp:positionV>
-                <wp:extent cx="2695575" cy="676275"/>
-                <wp:effectExtent l="19050" t="19050" r="47625" b="47625"/>
-                <wp:wrapNone/>
-                <wp:docPr id="33" name="Rectangle: Rounded Corners 33"/>
-                <wp:cNvGraphicFramePr/>
-                <a:graphic xmlns:a="http://schemas.openxmlformats.org/drawingml/2006/main">
-                  <a:graphicData uri="http://schemas.microsoft.com/office/word/2010/wordprocessingShape">
-                    <wps:wsp>
-                      <wps:cNvSpPr/>
-                      <wps:spPr>
-                        <a:xfrm>
-                          <a:off x="0" y="0"/>
-                          <a:ext cx="2695575" cy="676275"/>
-                        </a:xfrm>
-                        <a:prstGeom prst="roundRect">
-                          <a:avLst/>
-                        </a:prstGeom>
-                        <a:noFill/>
-                        <a:ln w="57150">
-                          <a:solidFill>
-                            <a:srgbClr val="FF0000"/>
-                          </a:solidFill>
-                        </a:ln>
-                      </wps:spPr>
-                      <wps:style>
-                        <a:lnRef idx="2">
-                          <a:schemeClr val="accent1">
-                            <a:shade val="50000"/>
-                          </a:schemeClr>
-                        </a:lnRef>
-                        <a:fillRef idx="1">
-                          <a:schemeClr val="accent1"/>
-                        </a:fillRef>
-                        <a:effectRef idx="0">
-                          <a:schemeClr val="accent1"/>
-                        </a:effectRef>
-                        <a:fontRef idx="minor">
-                          <a:schemeClr val="lt1"/>
-                        </a:fontRef>
-                      </wps:style>
-                      <wps:bodyPr rot="0" spcFirstLastPara="0" vertOverflow="overflow" horzOverflow="overflow" vert="horz" wrap="square" lIns="91440" tIns="45720" rIns="91440" bIns="45720" numCol="1" spcCol="0" rtlCol="0" fromWordArt="0" anchor="ctr" anchorCtr="0" forceAA="0" compatLnSpc="1">
-                        <a:prstTxWarp prst="textNoShape">
-                          <a:avLst/>
-                        </a:prstTxWarp>
-                        <a:noAutofit/>
-                      </wps:bodyPr>
-                    </wps:wsp>
-                  </a:graphicData>
-                </a:graphic>
-                <wp14:sizeRelH relativeFrom="margin">
-                  <wp14:pctWidth>0</wp14:pctWidth>
-                </wp14:sizeRelH>
-                <wp14:sizeRelV relativeFrom="margin">
-                  <wp14:pctHeight>0</wp14:pctHeight>
-                </wp14:sizeRelV>
-              </wp:anchor>
-            </w:drawing>
-          </mc:Choice>
-          <mc:Fallback>
-            <w:pict>
-              <v:roundrect w14:anchorId="1D8F682B" id="Rectangle: Rounded Corners 33" o:spid="_x0000_s1026" style="position:absolute;margin-left:120pt;margin-top:180pt;width:212.25pt;height:53.25pt;z-index:251683840;visibility:visible;mso-wrap-style:square;mso-width-percent:0;mso-height-percent:0;mso-wrap-distance-left:9pt;mso-wrap-distance-top:0;mso-wrap-distance-right:9pt;mso-wrap-distance-bottom:0;mso-position-horizontal:absolute;mso-position-horizontal-relative:text;mso-position-vertical:absolute;mso-position-vertical-relative:text;mso-width-percent:0;mso-height-percent:0;mso-width-relative:margin;mso-height-relative:margin;v-text-anchor:middle" arcsize="10923f" o:gfxdata="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" filled="f" strokecolor="red" strokeweight="4.5pt">
-                <v:stroke joinstyle="miter"/>
-              </v:roundrect>
-            </w:pict>
-          </mc:Fallback>
-        </mc:AlternateContent>
-      </w:r>
-      <w:r>
-        <w:rPr>
-          <w:noProof/>
-        </w:rPr>
-        <w:drawing>
-          <wp:inline distT="0" distB="0" distL="0" distR="0" wp14:anchorId="70C10002" wp14:editId="57BE7A53">
-            <wp:extent cx="2492389" cy="5400000"/>
-            <wp:effectExtent l="0" t="0" r="3175" b="0"/>
-            <wp:docPr id="17" name="Picture 17"/>
-            <wp:cNvGraphicFramePr>
-              <a:graphicFrameLocks xmlns:a="http://schemas.openxmlformats.org/drawingml/2006/main" noChangeAspect="1"/>
-            </wp:cNvGraphicFramePr>
-            <a:graphic xmlns:a="http://schemas.openxmlformats.org/drawingml/2006/main">
-              <a:graphicData uri="http://schemas.openxmlformats.org/drawingml/2006/picture">
-                <pic:pic xmlns:pic="http://schemas.openxmlformats.org/drawingml/2006/picture">
-                  <pic:nvPicPr>
-                    <pic:cNvPr id="0" name="Picture 28"/>
-                    <pic:cNvPicPr>
-                      <a:picLocks noChangeAspect="1" noChangeArrowheads="1"/>
-                    </pic:cNvPicPr>
-                  </pic:nvPicPr>
-                  <pic:blipFill>
-                    <a:blip r:embed="rId27" cstate="print">
-                      <a:extLst>
-                        <a:ext uri="{28A0092B-C50C-407E-A947-70E740481C1C}">
-                          <a14:useLocalDpi xmlns:a14="http://schemas.microsoft.com/office/drawing/2010/main" val="0"/>
-                        </a:ext>
-                      </a:extLst>
-                    </a:blip>
-                    <a:srcRect/>
-                    <a:stretch>
-                      <a:fillRect/>
-                    </a:stretch>
-                  </pic:blipFill>
-                  <pic:spPr bwMode="auto">
-                    <a:xfrm>
-                      <a:off x="0" y="0"/>
-                      <a:ext cx="2492389" cy="5400000"/>
-                    </a:xfrm>
-                    <a:prstGeom prst="rect">
-                      <a:avLst/>
-                    </a:prstGeom>
-                    <a:noFill/>
-                    <a:ln>
-                      <a:noFill/>
-                    </a:ln>
-                  </pic:spPr>
-                </pic:pic>
-              </a:graphicData>
-            </a:graphic>
-          </wp:inline>
-        </w:drawing>
-      </w:r>
-    </w:p>
-    <w:p>
-      <w:pPr>
-        <w:pStyle w:val="ListParagraph"/>
-        <w:numPr>
-          <w:ilvl w:val="0"/>
-          <w:numId w:val="3"/>
-        </w:numPr>
-        <w:jc w:val="both"/>
-        <w:rPr>
-          <w:rFonts w:ascii="Arial" w:hAnsi="Arial" w:cs="Arial"/>
-          <w:sz w:val="24"/>
-          <w:szCs w:val="24"/>
-          <w:lang w:val="en-PK"/>
-        </w:rPr>
-      </w:pPr>
-      <w:proofErr w:type="spellStart"/>
-      <w:r>
-        <w:rPr>
-          <w:rFonts w:ascii="Arial" w:hAnsi="Arial" w:cs="Arial"/>
-          <w:sz w:val="24"/>
-          <w:szCs w:val="24"/>
-          <w:lang w:val="en-PK"/>
-        </w:rPr>
-        <w:t>AirContacts</w:t>
-      </w:r>
-      <w:proofErr w:type="spellEnd"/>
-      <w:r>
-        <w:rPr>
-          <w:rFonts w:ascii="Arial" w:hAnsi="Arial" w:cs="Arial"/>
-          <w:sz w:val="24"/>
-          <w:szCs w:val="24"/>
-          <w:lang w:val="en-PK"/>
-        </w:rPr>
-        <w:t xml:space="preserve"> App Information Page</w:t>
-      </w:r>
-    </w:p>
-    <w:p>
-      <w:pPr>
-        <w:pStyle w:val="ListParagraph"/>
-        <w:jc w:val="both"/>
-        <w:rPr>
-          <w:rFonts w:ascii="Arial" w:hAnsi="Arial" w:cs="Arial"/>
-          <w:sz w:val="24"/>
-          <w:szCs w:val="24"/>
-          <w:lang w:val="en-PK"/>
-        </w:rPr>
-      </w:pPr>
-    </w:p>
-    <w:p>
-      <w:pPr>
-        <w:pStyle w:val="ListParagraph"/>
-        <w:numPr>
-          <w:ilvl w:val="0"/>
-          <w:numId w:val="3"/>
-        </w:numPr>
-        <w:jc w:val="both"/>
-        <w:rPr>
-          <w:rFonts w:ascii="Arial" w:hAnsi="Arial" w:cs="Arial"/>
-          <w:sz w:val="24"/>
-          <w:szCs w:val="24"/>
-          <w:lang w:val="en-PK"/>
-        </w:rPr>
-      </w:pPr>
-      <w:r>
-        <w:rPr>
-          <w:rFonts w:ascii="Arial" w:hAnsi="Arial" w:cs="Arial"/>
-          <w:sz w:val="24"/>
-          <w:szCs w:val="24"/>
-          <w:lang w:val="en-PK"/>
-        </w:rPr>
-        <w:t xml:space="preserve">Tapping on </w:t>
-      </w:r>
-      <w:r>
-        <w:rPr>
-          <w:rFonts w:ascii="Arial" w:hAnsi="Arial" w:cs="Arial"/>
-          <w:noProof/>
-          <w:sz w:val="24"/>
-          <w:szCs w:val="24"/>
-          <w:lang w:val="en-PK"/>
-        </w:rPr>
-        <w:drawing>
-          <wp:inline distT="0" distB="0" distL="0" distR="0" wp14:anchorId="79E8075B" wp14:editId="556F21BF">
-            <wp:extent cx="2295845" cy="552527"/>
-            <wp:effectExtent l="0" t="0" r="9525" b="0"/>
-            <wp:docPr id="34" name="Picture 34"/>
-            <wp:cNvGraphicFramePr>
-              <a:graphicFrameLocks xmlns:a="http://schemas.openxmlformats.org/drawingml/2006/main" noChangeAspect="1"/>
-            </wp:cNvGraphicFramePr>
-            <a:graphic xmlns:a="http://schemas.openxmlformats.org/drawingml/2006/main">
-              <a:graphicData uri="http://schemas.openxmlformats.org/drawingml/2006/picture">
-                <pic:pic xmlns:pic="http://schemas.openxmlformats.org/drawingml/2006/picture">
-                  <pic:nvPicPr>
-                    <pic:cNvPr id="1" name=""/>
-                    <pic:cNvPicPr/>
-                  </pic:nvPicPr>
-                  <pic:blipFill>
-                    <a:blip r:embed="rId28"/>
-                    <a:stretch>
-                      <a:fillRect/>
-                    </a:stretch>
-                  </pic:blipFill>
-                  <pic:spPr>
-                    <a:xfrm>
-                      <a:off x="0" y="0"/>
-                      <a:ext cx="2295845" cy="552527"/>
-                    </a:xfrm>
-                    <a:prstGeom prst="rect">
-                      <a:avLst/>
-                    </a:prstGeom>
-                  </pic:spPr>
-                </pic:pic>
-              </a:graphicData>
-            </a:graphic>
-          </wp:inline>
-        </w:drawing>
-      </w:r>
-      <w:r>
-        <w:rPr>
-          <w:rFonts w:ascii="Arial" w:hAnsi="Arial" w:cs="Arial"/>
-          <w:sz w:val="24"/>
-          <w:szCs w:val="24"/>
-          <w:lang w:val="en-PK"/>
-        </w:rPr>
-        <w:t>will take the user to this User Guide.</w:t>
-      </w:r>
-    </w:p>
-    <w:p>
-      <w:pPr>
-        <w:jc w:val="center"/>
-        <w:rPr>
-          <w:rFonts w:ascii="Arial" w:hAnsi="Arial" w:cs="Arial"/>
-          <w:sz w:val="24"/>
-          <w:szCs w:val="24"/>
-        </w:rPr>
-      </w:pPr>
-      <w:r>
-        <w:rPr>
           <w:rStyle w:val="EndnoteReference"/>
           <w:rFonts w:ascii="Arial" w:hAnsi="Arial" w:cs="Arial"/>
           <w:sz w:val="24"/>
@@ -3481,9 +4078,9 @@
       </w:r>
     </w:p>
     <w:sectPr>
-      <w:headerReference w:type="default" r:id="rId29"/>
-      <w:footerReference w:type="default" r:id="rId30"/>
-      <w:pgSz w:w="11906" w:h="16838" w:code="9"/>
+      <w:headerReference w:type="default" r:id="rId30"/>
+      <w:footerReference w:type="default" r:id="rId31"/>
+      <w:pgSz w:w="16838" w:h="11906" w:orient="landscape" w:code="9"/>
       <w:pgMar w:top="720" w:right="720" w:bottom="720" w:left="2160" w:header="432" w:footer="432" w:gutter="0"/>
       <w:cols w:sep="1" w:space="709"/>
       <w:docGrid w:linePitch="360"/>
@@ -3776,8 +4373,14 @@
     <w:r>
       <w:rPr>
         <w:rFonts w:asciiTheme="minorBidi" w:hAnsiTheme="minorBidi"/>
-        <w:color w:val="7F7F7F" w:themeColor="background1" w:themeShade="7F"/>
-        <w:spacing w:val="60"/>
+        <w:sz w:val="24"/>
+        <w:szCs w:val="24"/>
+      </w:rPr>
+      <w:t xml:space="preserve"> </w:t>
+    </w:r>
+    <w:r>
+      <w:rPr>
+        <w:rFonts w:asciiTheme="minorBidi" w:hAnsiTheme="minorBidi"/>
         <w:sz w:val="24"/>
         <w:szCs w:val="24"/>
       </w:rPr>
@@ -3788,8 +4391,6 @@
         <w:rFonts w:asciiTheme="minorBidi" w:hAnsiTheme="minorBidi"/>
         <w:b/>
         <w:bCs/>
-        <w:color w:val="7F7F7F" w:themeColor="background1" w:themeShade="7F"/>
-        <w:spacing w:val="60"/>
         <w:sz w:val="24"/>
         <w:szCs w:val="24"/>
       </w:rPr>
@@ -3800,8 +4401,6 @@
         <w:rFonts w:asciiTheme="minorBidi" w:hAnsiTheme="minorBidi"/>
         <w:b/>
         <w:bCs/>
-        <w:color w:val="7F7F7F" w:themeColor="background1" w:themeShade="7F"/>
-        <w:spacing w:val="60"/>
         <w:sz w:val="24"/>
         <w:szCs w:val="24"/>
       </w:rPr>
@@ -3812,8 +4411,6 @@
         <w:rFonts w:asciiTheme="minorBidi" w:hAnsiTheme="minorBidi"/>
         <w:b/>
         <w:bCs/>
-        <w:color w:val="7F7F7F" w:themeColor="background1" w:themeShade="7F"/>
-        <w:spacing w:val="60"/>
         <w:sz w:val="24"/>
         <w:szCs w:val="24"/>
       </w:rPr>
@@ -3824,21 +4421,16 @@
         <w:rFonts w:asciiTheme="minorBidi" w:hAnsiTheme="minorBidi"/>
         <w:b/>
         <w:bCs/>
-        <w:noProof/>
-        <w:color w:val="7F7F7F" w:themeColor="background1" w:themeShade="7F"/>
-        <w:spacing w:val="60"/>
         <w:sz w:val="24"/>
         <w:szCs w:val="24"/>
       </w:rPr>
-      <w:t>1</w:t>
+      <w:t>7</w:t>
     </w:r>
     <w:r>
       <w:rPr>
         <w:rFonts w:asciiTheme="minorBidi" w:hAnsiTheme="minorBidi"/>
         <w:b/>
         <w:bCs/>
-        <w:color w:val="7F7F7F" w:themeColor="background1" w:themeShade="7F"/>
-        <w:spacing w:val="60"/>
         <w:sz w:val="24"/>
         <w:szCs w:val="24"/>
       </w:rPr>
@@ -3847,8 +4439,6 @@
     <w:r>
       <w:rPr>
         <w:rFonts w:asciiTheme="minorBidi" w:hAnsiTheme="minorBidi"/>
-        <w:color w:val="7F7F7F" w:themeColor="background1" w:themeShade="7F"/>
-        <w:spacing w:val="60"/>
         <w:sz w:val="24"/>
         <w:szCs w:val="24"/>
       </w:rPr>
@@ -3859,8 +4449,6 @@
         <w:rFonts w:asciiTheme="minorBidi" w:hAnsiTheme="minorBidi"/>
         <w:b/>
         <w:bCs/>
-        <w:color w:val="7F7F7F" w:themeColor="background1" w:themeShade="7F"/>
-        <w:spacing w:val="60"/>
         <w:sz w:val="24"/>
         <w:szCs w:val="24"/>
       </w:rPr>
@@ -3871,8 +4459,6 @@
         <w:rFonts w:asciiTheme="minorBidi" w:hAnsiTheme="minorBidi"/>
         <w:b/>
         <w:bCs/>
-        <w:color w:val="7F7F7F" w:themeColor="background1" w:themeShade="7F"/>
-        <w:spacing w:val="60"/>
         <w:sz w:val="24"/>
         <w:szCs w:val="24"/>
       </w:rPr>
@@ -3883,8 +4469,6 @@
         <w:rFonts w:asciiTheme="minorBidi" w:hAnsiTheme="minorBidi"/>
         <w:b/>
         <w:bCs/>
-        <w:color w:val="7F7F7F" w:themeColor="background1" w:themeShade="7F"/>
-        <w:spacing w:val="60"/>
         <w:sz w:val="24"/>
         <w:szCs w:val="24"/>
       </w:rPr>
@@ -3895,21 +4479,16 @@
         <w:rFonts w:asciiTheme="minorBidi" w:hAnsiTheme="minorBidi"/>
         <w:b/>
         <w:bCs/>
-        <w:noProof/>
-        <w:color w:val="7F7F7F" w:themeColor="background1" w:themeShade="7F"/>
-        <w:spacing w:val="60"/>
         <w:sz w:val="24"/>
         <w:szCs w:val="24"/>
       </w:rPr>
-      <w:t>2</w:t>
+      <w:t>12</w:t>
     </w:r>
     <w:r>
       <w:rPr>
         <w:rFonts w:asciiTheme="minorBidi" w:hAnsiTheme="minorBidi"/>
         <w:b/>
         <w:bCs/>
-        <w:color w:val="7F7F7F" w:themeColor="background1" w:themeShade="7F"/>
-        <w:spacing w:val="60"/>
         <w:sz w:val="24"/>
         <w:szCs w:val="24"/>
       </w:rPr>
@@ -4859,6 +5438,40 @@
     <w:name w:val="Normal"/>
     <w:qFormat/>
   </w:style>
+  <w:style w:type="paragraph" w:styleId="Heading1">
+    <w:name w:val="heading 1"/>
+    <w:basedOn w:val="IntenseHeading"/>
+    <w:next w:val="Normal"/>
+    <w:link w:val="Heading1Char"/>
+    <w:uiPriority w:val="9"/>
+    <w:qFormat/>
+    <w:rsid w:val="0099015A"/>
+    <w:pPr>
+      <w:outlineLvl w:val="0"/>
+    </w:pPr>
+  </w:style>
+  <w:style w:type="paragraph" w:styleId="Heading2">
+    <w:name w:val="heading 2"/>
+    <w:basedOn w:val="Normal"/>
+    <w:next w:val="Normal"/>
+    <w:link w:val="Heading2Char"/>
+    <w:uiPriority w:val="9"/>
+    <w:unhideWhenUsed/>
+    <w:qFormat/>
+    <w:rsid w:val="0099015A"/>
+    <w:pPr>
+      <w:keepNext/>
+      <w:keepLines/>
+      <w:spacing w:before="40" w:after="0"/>
+      <w:outlineLvl w:val="1"/>
+    </w:pPr>
+    <w:rPr>
+      <w:rFonts w:asciiTheme="majorHAnsi" w:eastAsiaTheme="majorEastAsia" w:hAnsiTheme="majorHAnsi" w:cstheme="majorBidi"/>
+      <w:color w:val="2F5496" w:themeColor="accent1" w:themeShade="BF"/>
+      <w:sz w:val="26"/>
+      <w:szCs w:val="26"/>
+    </w:rPr>
+  </w:style>
   <w:style w:type="character" w:default="1" w:styleId="DefaultParagraphFont">
     <w:name w:val="Default Paragraph Font"/>
     <w:uiPriority w:val="1"/>
@@ -5002,6 +5615,7 @@
   <w:style w:type="paragraph" w:customStyle="1" w:styleId="IntenseHeading">
     <w:name w:val="Intense Heading"/>
     <w:basedOn w:val="IntenseQuote"/>
+    <w:link w:val="IntenseHeadingChar"/>
     <w:qFormat/>
     <w:rsid w:val="00673EE8"/>
     <w:rPr>
@@ -5099,6 +5713,109 @@
     <w:rsid w:val="00291C3D"/>
     <w:rPr>
       <w:vertAlign w:val="superscript"/>
+    </w:rPr>
+  </w:style>
+  <w:style w:type="character" w:customStyle="1" w:styleId="Heading1Char">
+    <w:name w:val="Heading 1 Char"/>
+    <w:basedOn w:val="DefaultParagraphFont"/>
+    <w:link w:val="Heading1"/>
+    <w:uiPriority w:val="9"/>
+    <w:rsid w:val="0099015A"/>
+    <w:rPr>
+      <w:rFonts w:ascii="Arial" w:hAnsi="Arial"/>
+      <w:b/>
+      <w:iCs/>
+      <w:color w:val="4472C4" w:themeColor="accent1"/>
+      <w:sz w:val="32"/>
+      <w:lang w:val="en-PK"/>
+    </w:rPr>
+  </w:style>
+  <w:style w:type="paragraph" w:styleId="TOCHeading">
+    <w:name w:val="TOC Heading"/>
+    <w:basedOn w:val="Heading1"/>
+    <w:next w:val="Normal"/>
+    <w:uiPriority w:val="39"/>
+    <w:unhideWhenUsed/>
+    <w:qFormat/>
+    <w:rsid w:val="003A47E2"/>
+    <w:pPr>
+      <w:outlineLvl w:val="9"/>
+    </w:pPr>
+    <w:rPr>
+      <w:lang w:val="en-US"/>
+    </w:rPr>
+  </w:style>
+  <w:style w:type="character" w:customStyle="1" w:styleId="IntenseHeadingChar">
+    <w:name w:val="Intense Heading Char"/>
+    <w:basedOn w:val="IntenseQuoteChar"/>
+    <w:link w:val="IntenseHeading"/>
+    <w:rsid w:val="003A47E2"/>
+    <w:rPr>
+      <w:rFonts w:ascii="Arial" w:hAnsi="Arial"/>
+      <w:b/>
+      <w:i w:val="0"/>
+      <w:iCs/>
+      <w:color w:val="4472C4" w:themeColor="accent1"/>
+      <w:sz w:val="32"/>
+      <w:lang w:val="en-PK"/>
+    </w:rPr>
+  </w:style>
+  <w:style w:type="paragraph" w:styleId="TOC1">
+    <w:name w:val="toc 1"/>
+    <w:basedOn w:val="Normal"/>
+    <w:next w:val="Normal"/>
+    <w:autoRedefine/>
+    <w:uiPriority w:val="39"/>
+    <w:unhideWhenUsed/>
+    <w:rsid w:val="0099015A"/>
+    <w:pPr>
+      <w:spacing w:after="100"/>
+    </w:pPr>
+  </w:style>
+  <w:style w:type="character" w:styleId="Hyperlink">
+    <w:name w:val="Hyperlink"/>
+    <w:basedOn w:val="DefaultParagraphFont"/>
+    <w:uiPriority w:val="99"/>
+    <w:unhideWhenUsed/>
+    <w:rsid w:val="0099015A"/>
+    <w:rPr>
+      <w:color w:val="0563C1" w:themeColor="hyperlink"/>
+      <w:u w:val="single"/>
+    </w:rPr>
+  </w:style>
+  <w:style w:type="character" w:customStyle="1" w:styleId="Heading2Char">
+    <w:name w:val="Heading 2 Char"/>
+    <w:basedOn w:val="DefaultParagraphFont"/>
+    <w:link w:val="Heading2"/>
+    <w:uiPriority w:val="9"/>
+    <w:rsid w:val="0099015A"/>
+    <w:rPr>
+      <w:rFonts w:asciiTheme="majorHAnsi" w:eastAsiaTheme="majorEastAsia" w:hAnsiTheme="majorHAnsi" w:cstheme="majorBidi"/>
+      <w:color w:val="2F5496" w:themeColor="accent1" w:themeShade="BF"/>
+      <w:sz w:val="26"/>
+      <w:szCs w:val="26"/>
+    </w:rPr>
+  </w:style>
+  <w:style w:type="paragraph" w:styleId="TOC2">
+    <w:name w:val="toc 2"/>
+    <w:basedOn w:val="Normal"/>
+    <w:next w:val="Normal"/>
+    <w:autoRedefine/>
+    <w:uiPriority w:val="39"/>
+    <w:unhideWhenUsed/>
+    <w:rsid w:val="007152D7"/>
+    <w:pPr>
+      <w:tabs>
+        <w:tab w:val="right" w:leader="dot" w:pos="13948"/>
+      </w:tabs>
+      <w:spacing w:after="100"/>
+      <w:ind w:left="220"/>
+    </w:pPr>
+    <w:rPr>
+      <w:rFonts w:asciiTheme="minorBidi" w:hAnsiTheme="minorBidi"/>
+      <w:noProof/>
+      <w:sz w:val="20"/>
+      <w:szCs w:val="20"/>
     </w:rPr>
   </w:style>
 </w:styles>

</xml_diff>